<commit_message>
[CHANGE] improve the code for better performance of the word presentation
</commit_message>
<xml_diff>
--- a/assets/templates/template_scada.docx
+++ b/assets/templates/template_scada.docx
@@ -248,38 +248,37 @@
     </w:p>
     <w:p>
       <w:pPr>
+        <w:jc w:val="center"/>
+        <w:rPr>
+          <w:sz w:val="36"/>
+          <w:szCs w:val="36"/>
+        </w:rPr>
+      </w:pPr>
+      <w:r>
         <w:rPr>
           <w:b/>
           <w:bCs/>
           <w:sz w:val="36"/>
           <w:szCs w:val="36"/>
         </w:rPr>
-      </w:pPr>
-    </w:p>
-    <w:p>
-      <w:pPr>
-        <w:jc w:val="center"/>
+        <w:t>Client :</w:t>
+      </w:r>
+      <w:r>
         <w:rPr>
           <w:sz w:val="36"/>
           <w:szCs w:val="36"/>
         </w:rPr>
-      </w:pPr>
-      <w:r>
-        <w:rPr>
-          <w:b/>
-          <w:bCs/>
+        <w:t xml:space="preserve"> {{CLIENT}}</w:t>
+      </w:r>
+    </w:p>
+    <w:p>
+      <w:pPr>
+        <w:jc w:val="center"/>
+        <w:rPr>
           <w:sz w:val="36"/>
           <w:szCs w:val="36"/>
         </w:rPr>
-        <w:t>Client :</w:t>
-      </w:r>
-      <w:r>
-        <w:rPr>
-          <w:sz w:val="36"/>
-          <w:szCs w:val="36"/>
-        </w:rPr>
-        <w:t xml:space="preserve"> {{CLIENT}}</w:t>
-      </w:r>
+      </w:pPr>
     </w:p>
     <w:tbl>
       <w:tblPr>
@@ -992,7 +991,7 @@
       </w:r>
       <w:proofErr w:type="spellStart"/>
       <w:r>
-        <w:t>Nom_du_parc</w:t>
+        <w:t>park_name</w:t>
       </w:r>
       <w:proofErr w:type="spellEnd"/>
       <w:r>
@@ -1005,7 +1004,7 @@
       </w:r>
       <w:proofErr w:type="spellStart"/>
       <w:r>
-        <w:t>Modele_turbine</w:t>
+        <w:t>model_wtg</w:t>
       </w:r>
       <w:proofErr w:type="spellEnd"/>
       <w:r>
@@ -1037,429 +1036,427 @@
       </w:r>
       <w:proofErr w:type="spellStart"/>
       <w:r>
-        <w:t>P</w:t>
-      </w:r>
-      <w:r>
-        <w:t>uissance_</w:t>
-      </w:r>
+        <w:t>nominal_power</w:t>
+      </w:r>
+      <w:proofErr w:type="spellEnd"/>
+      <w:r>
+        <w:t xml:space="preserve">}} </w:t>
+      </w:r>
+    </w:p>
+    <w:p>
+      <w:r>
+        <w:t xml:space="preserve">Localisation : {{LOCALISATION}} </w:t>
+      </w:r>
+    </w:p>
+    <w:p>
+      <w:r>
+        <w:t>Client : {{CLIENT}}</w:t>
+      </w:r>
+    </w:p>
+    <w:p>
+      <w:r>
+        <w:t xml:space="preserve">Contact : {{CONTACT_CLIENT}} </w:t>
+      </w:r>
+    </w:p>
+    <w:p>
+      <w:r>
+        <w:t xml:space="preserve">Constructeur / Exploitant : {{CONTRACTOR}} </w:t>
+      </w:r>
+    </w:p>
+    <w:p/>
+    <w:p>
+      <w:r>
+        <w:t>Rédacteur</w:t>
+      </w:r>
+    </w:p>
+    <w:p>
+      <w:r>
+        <w:t>{{AUTEUR}}</w:t>
+      </w:r>
+    </w:p>
+    <w:p>
       <w:proofErr w:type="gramStart"/>
       <w:r>
-        <w:t>nominale</w:t>
+        <w:t>Email</w:t>
+      </w:r>
+      <w:proofErr w:type="gramEnd"/>
+      <w:r>
+        <w:t xml:space="preserve"> : {{MAIL_AUTEUR}}</w:t>
+      </w:r>
+    </w:p>
+    <w:p>
+      <w:r>
+        <w:t>Téléphone : {{TEL_AUTEUR}}</w:t>
+      </w:r>
+    </w:p>
+    <w:p/>
+    <w:p>
+      <w:r>
+        <w:t>Vérificateur</w:t>
+      </w:r>
+    </w:p>
+    <w:p>
+      <w:r>
+        <w:t>{{VERIFICATEUR}}</w:t>
+      </w:r>
+    </w:p>
+    <w:p>
+      <w:proofErr w:type="gramStart"/>
+      <w:r>
+        <w:t>Email</w:t>
+      </w:r>
+      <w:proofErr w:type="gramEnd"/>
+      <w:r>
+        <w:t xml:space="preserve"> : {{MAIL_VERIFICATEUR}}</w:t>
+      </w:r>
+    </w:p>
+    <w:p>
+      <w:r>
+        <w:t>Téléphone : {{TEL_VERIFICATEUR}}</w:t>
+      </w:r>
+    </w:p>
+    <w:p/>
+    <w:p>
+      <w:r>
+        <w:t>Approbateur</w:t>
+      </w:r>
+    </w:p>
+    <w:p>
+      <w:r>
+        <w:t>{{APPROBATEUR}}</w:t>
+      </w:r>
+    </w:p>
+    <w:p>
+      <w:proofErr w:type="gramStart"/>
+      <w:r>
+        <w:t>Email</w:t>
+      </w:r>
+      <w:proofErr w:type="gramEnd"/>
+      <w:r>
+        <w:t xml:space="preserve"> : {{MAIL_APPROBATEUR}}</w:t>
+      </w:r>
+    </w:p>
+    <w:p>
+      <w:r>
+        <w:t>Téléphone : {{TEL_APPROBATEUR}}</w:t>
+      </w:r>
+    </w:p>
+    <w:p/>
+    <w:p>
+      <w:pPr>
+        <w:spacing w:after="160" w:line="259" w:lineRule="auto"/>
+      </w:pPr>
+      <w:r>
+        <w:br w:type="page"/>
+      </w:r>
+    </w:p>
+    <w:p/>
+    <w:p>
+      <w:pPr>
+        <w:pStyle w:val="Titre1"/>
+      </w:pPr>
+      <w:r>
+        <w:t>Synthèse</w:t>
+      </w:r>
+    </w:p>
+    <w:p>
+      <w:pPr>
+        <w:jc w:val="both"/>
+      </w:pPr>
+      <w:r>
+        <w:t xml:space="preserve">Les données SCADA du parc éolien </w:t>
+      </w:r>
+      <w:r>
+        <w:t>{{</w:t>
+      </w:r>
+      <w:proofErr w:type="spellStart"/>
+      <w:r>
+        <w:t>park_name</w:t>
       </w:r>
       <w:proofErr w:type="spellEnd"/>
       <w:r>
+        <w:t>}}</w:t>
+      </w:r>
+      <w:r>
+        <w:t xml:space="preserve"> ont été analysées sur la période du </w:t>
+      </w:r>
+      <w:r>
+        <w:t>{{</w:t>
+      </w:r>
+      <w:proofErr w:type="spellStart"/>
+      <w:r>
+        <w:t>analysis_start</w:t>
+      </w:r>
+      <w:proofErr w:type="spellEnd"/>
+      <w:r>
+        <w:t>}}</w:t>
+      </w:r>
+      <w:r>
+        <w:t xml:space="preserve"> au </w:t>
+      </w:r>
+      <w:r>
+        <w:t>{{</w:t>
+      </w:r>
+      <w:proofErr w:type="spellStart"/>
+      <w:r>
+        <w:t>analysis_end</w:t>
+      </w:r>
+      <w:proofErr w:type="spellEnd"/>
+      <w:r>
+        <w:t>}}</w:t>
+      </w:r>
+      <w:r>
+        <w:t xml:space="preserve">, à partir des informations fournies par le client. Le parc est composé de </w:t>
+      </w:r>
+      <w:r>
+        <w:t>{{</w:t>
+      </w:r>
+      <w:proofErr w:type="spellStart"/>
+      <w:r>
+        <w:t>turbine_count</w:t>
+      </w:r>
+      <w:proofErr w:type="spellEnd"/>
+      <w:r>
+        <w:t>}}</w:t>
+      </w:r>
+      <w:r>
+        <w:t xml:space="preserve"> éoliennes de type</w:t>
+      </w:r>
+      <w:r>
         <w:t xml:space="preserve"> </w:t>
       </w:r>
       <w:r>
+        <w:t>{{</w:t>
+      </w:r>
+      <w:proofErr w:type="spellStart"/>
+      <w:r>
+        <w:t>model_wtg</w:t>
+      </w:r>
+      <w:proofErr w:type="spellEnd"/>
+      <w:r>
         <w:t>}</w:t>
       </w:r>
+      <w:r>
+        <w:t>}</w:t>
+      </w:r>
+      <w:r>
+        <w:t xml:space="preserve">, désignées </w:t>
+      </w:r>
+      <w:r>
+        <w:t>{{</w:t>
+      </w:r>
+      <w:proofErr w:type="spellStart"/>
+      <w:r>
+        <w:t>turbine_list</w:t>
+      </w:r>
+      <w:proofErr w:type="spellEnd"/>
+      <w:r>
+        <w:t>}}</w:t>
+      </w:r>
+      <w:r>
+        <w:t xml:space="preserve"> L’ensemble des turbines a été pris en compte dans l’analyse.</w:t>
+      </w:r>
+    </w:p>
+    <w:p>
+      <w:pPr>
+        <w:jc w:val="both"/>
+      </w:pPr>
+    </w:p>
+    <w:p>
+      <w:pPr>
+        <w:jc w:val="both"/>
+      </w:pPr>
+      <w:r>
+        <w:t>Le tableau ci-après présente une évaluation synthétique des performances du parc, en mettant en évidence, pour chaque indicateur, le niveau de performance de chaque éolienne ainsi que les éventuels écarts observés.</w:t>
+      </w:r>
+    </w:p>
+    <w:p/>
+    <w:p>
+      <w:r>
+        <w:t>[</w:t>
+      </w:r>
+      <w:proofErr w:type="gramStart"/>
+      <w:r>
+        <w:t>T</w:t>
+      </w:r>
+      <w:r>
+        <w:t>ODO</w:t>
+      </w:r>
+      <w:r>
+        <w:t>:SCADA</w:t>
+      </w:r>
       <w:proofErr w:type="gramEnd"/>
       <w:r>
-        <w:t xml:space="preserve">} </w:t>
-      </w:r>
-    </w:p>
-    <w:p>
-      <w:r>
-        <w:t xml:space="preserve">Localisation : {{LOCALISATION}} </w:t>
-      </w:r>
-    </w:p>
-    <w:p>
-      <w:r>
-        <w:t>Client : {{CLIENT}}</w:t>
-      </w:r>
-    </w:p>
-    <w:p>
-      <w:r>
-        <w:t xml:space="preserve">Contact : {{CONTACT_CLIENT}} </w:t>
-      </w:r>
-    </w:p>
-    <w:p>
-      <w:r>
-        <w:t xml:space="preserve">Constructeur / Exploitant : {{CONTRACTOR}} </w:t>
-      </w:r>
-    </w:p>
-    <w:p/>
-    <w:p>
-      <w:r>
-        <w:t>Rédacteur</w:t>
-      </w:r>
-    </w:p>
-    <w:p>
-      <w:r>
-        <w:t>{{AUTEUR}}</w:t>
-      </w:r>
-    </w:p>
-    <w:p>
+        <w:t>_SUMMARY_TABLE]</w:t>
+      </w:r>
+    </w:p>
+    <w:p>
+      <w:pPr>
+        <w:pStyle w:val="Titre1"/>
+      </w:pPr>
+      <w:r>
+        <w:t>Contexte de l’étude</w:t>
+      </w:r>
+    </w:p>
+    <w:p>
+      <w:pPr>
+        <w:pStyle w:val="Titre2"/>
+      </w:pPr>
+      <w:r>
+        <w:t>Présentation générale du parc</w:t>
+      </w:r>
+    </w:p>
+    <w:p>
+      <w:pPr>
+        <w:jc w:val="both"/>
+      </w:pPr>
+      <w:r>
+        <w:t>Le parc éolien {{</w:t>
+      </w:r>
+      <w:proofErr w:type="spellStart"/>
+      <w:r>
+        <w:t>park_name</w:t>
+      </w:r>
+      <w:proofErr w:type="spellEnd"/>
+      <w:r>
+        <w:t>}} est situé sur le territoire des communes de {{COMMUNES}}, dans la région de {{REGION}}. Il est composé de {{</w:t>
+      </w:r>
+      <w:proofErr w:type="spellStart"/>
+      <w:r>
+        <w:t>turbine_count</w:t>
+      </w:r>
+      <w:proofErr w:type="spellEnd"/>
+      <w:r>
+        <w:t>}} éoliennes de type {{</w:t>
+      </w:r>
+      <w:proofErr w:type="spellStart"/>
+      <w:r>
+        <w:t>model_wtg</w:t>
+      </w:r>
+      <w:proofErr w:type="spellEnd"/>
+      <w:r>
+        <w:t>}}, d’une puissance nominale unitaire de {{</w:t>
+      </w:r>
+      <w:proofErr w:type="spellStart"/>
+      <w:r>
+        <w:t>nominal_power</w:t>
+      </w:r>
+      <w:proofErr w:type="spellEnd"/>
+      <w:r>
+        <w:t>}}, soit une puissance totale installée de {{</w:t>
+      </w:r>
+      <w:proofErr w:type="spellStart"/>
+      <w:r>
+        <w:t>total_</w:t>
+      </w:r>
       <w:proofErr w:type="gramStart"/>
       <w:r>
-        <w:t>Email</w:t>
+        <w:t>power</w:t>
+      </w:r>
+      <w:proofErr w:type="spellEnd"/>
+      <w:r>
+        <w:t xml:space="preserve"> </w:t>
+      </w:r>
+      <w:r>
+        <w:t>}</w:t>
       </w:r>
       <w:proofErr w:type="gramEnd"/>
       <w:r>
-        <w:t xml:space="preserve"> : {{MAIL_AUTEUR}}</w:t>
-      </w:r>
-    </w:p>
-    <w:p>
-      <w:r>
-        <w:t>Téléphone : {{TEL_AUTEUR}}</w:t>
-      </w:r>
-    </w:p>
-    <w:p/>
-    <w:p>
-      <w:r>
-        <w:t>Vérificateur</w:t>
-      </w:r>
-    </w:p>
-    <w:p>
-      <w:r>
-        <w:t>{{VERIFICATEUR}}</w:t>
-      </w:r>
-    </w:p>
-    <w:p>
+        <w:t>}.</w:t>
+      </w:r>
+    </w:p>
+    <w:p>
+      <w:pPr>
+        <w:jc w:val="both"/>
+      </w:pPr>
+      <w:r>
+        <w:t>Les éoliennes du parc sont identifiées comme suit : {{</w:t>
+      </w:r>
+      <w:proofErr w:type="spellStart"/>
+      <w:r>
+        <w:t>turbine_list</w:t>
+      </w:r>
+      <w:proofErr w:type="spellEnd"/>
+      <w:r>
+        <w:t xml:space="preserve">}}. L’implantation du parc et la disposition des éoliennes sont </w:t>
+      </w:r>
+      <w:proofErr w:type="spellStart"/>
+      <w:r>
+        <w:t>présen</w:t>
+      </w:r>
+      <w:proofErr w:type="spellEnd"/>
+      <w:r>
+        <w:t xml:space="preserve"> </w:t>
+      </w:r>
+      <w:proofErr w:type="spellStart"/>
+      <w:r>
+        <w:t>tées</w:t>
+      </w:r>
+      <w:proofErr w:type="spellEnd"/>
+      <w:r>
+        <w:t xml:space="preserve"> dans la figure ci-</w:t>
+      </w:r>
+      <w:r>
+        <w:t>après :</w:t>
+      </w:r>
+    </w:p>
+    <w:p>
+      <w:pPr>
+        <w:jc w:val="both"/>
+      </w:pPr>
+      <w:r>
+        <w:t>[TODO.IMAGE_POSITION]</w:t>
+      </w:r>
+    </w:p>
+    <w:p>
+      <w:r>
+        <w:t xml:space="preserve"> </w:t>
+      </w:r>
+    </w:p>
+    <w:p>
+      <w:pPr>
+        <w:pStyle w:val="Titre2"/>
+      </w:pPr>
+      <w:r>
+        <w:t>Coordonnées des éoliennes</w:t>
+      </w:r>
+    </w:p>
+    <w:p>
+      <w:r>
+        <w:t>Les coordonnées géographiques des éoliennes du parc sont présentées dans le tableau ci-dessous :</w:t>
+      </w:r>
+    </w:p>
+    <w:p>
+      <w:r>
+        <w:t>[TODO.TABLEAU COORDONNE GPS]</w:t>
+      </w:r>
+    </w:p>
+    <w:p>
+      <w:pPr>
+        <w:pStyle w:val="Titre2"/>
+      </w:pPr>
+      <w:r>
+        <w:t>Données fournies par le client</w:t>
+      </w:r>
+    </w:p>
+    <w:p>
+      <w:r>
+        <w:t>Dans le cadre de cette étude, plusieurs jeux de données ont été transmis par le client afin de permettre l’analyse des performances du parc éolien.</w:t>
+      </w:r>
+    </w:p>
+    <w:p>
+      <w:r>
+        <w:t>[</w:t>
+      </w:r>
       <w:proofErr w:type="gramStart"/>
       <w:r>
-        <w:t>Email</w:t>
-      </w:r>
-      <w:proofErr w:type="gramEnd"/>
-      <w:r>
-        <w:t xml:space="preserve"> : {{MAIL_VERIFICATEUR}}</w:t>
-      </w:r>
-    </w:p>
-    <w:p>
-      <w:r>
-        <w:t>Téléphone : {{TEL_VERIFICATEUR}}</w:t>
-      </w:r>
-    </w:p>
-    <w:p/>
-    <w:p>
-      <w:r>
-        <w:t>Approbateur</w:t>
-      </w:r>
-    </w:p>
-    <w:p>
-      <w:r>
-        <w:t>{{APPROBATEUR}}</w:t>
-      </w:r>
-    </w:p>
-    <w:p>
-      <w:proofErr w:type="gramStart"/>
-      <w:r>
-        <w:t>Email</w:t>
-      </w:r>
-      <w:proofErr w:type="gramEnd"/>
-      <w:r>
-        <w:t xml:space="preserve"> : {{MAIL_APPROBATEUR}}</w:t>
-      </w:r>
-    </w:p>
-    <w:p>
-      <w:r>
-        <w:t>Téléphone : {{TEL_APPROBATEUR}}</w:t>
-      </w:r>
-    </w:p>
-    <w:p/>
-    <w:p>
-      <w:pPr>
-        <w:spacing w:after="160" w:line="259" w:lineRule="auto"/>
-      </w:pPr>
-      <w:r>
-        <w:br w:type="page"/>
-      </w:r>
-    </w:p>
-    <w:p/>
-    <w:p>
-      <w:pPr>
-        <w:pStyle w:val="Titre1"/>
-      </w:pPr>
-      <w:r>
-        <w:t>Synthèse</w:t>
-      </w:r>
-    </w:p>
-    <w:p>
-      <w:pPr>
-        <w:jc w:val="both"/>
-      </w:pPr>
-      <w:r>
-        <w:t xml:space="preserve">Les données SCADA du parc éolien </w:t>
-      </w:r>
-      <w:r>
-        <w:t>{{</w:t>
-      </w:r>
-      <w:proofErr w:type="spellStart"/>
-      <w:r>
-        <w:t>park_name</w:t>
-      </w:r>
-      <w:proofErr w:type="spellEnd"/>
-      <w:r>
-        <w:t>}}</w:t>
-      </w:r>
-      <w:r>
-        <w:t xml:space="preserve"> ont été analysées sur la période du </w:t>
-      </w:r>
-      <w:r>
-        <w:t>{{</w:t>
-      </w:r>
-      <w:proofErr w:type="spellStart"/>
-      <w:r>
-        <w:t>analysis_start</w:t>
-      </w:r>
-      <w:proofErr w:type="spellEnd"/>
-      <w:r>
-        <w:t>}}</w:t>
-      </w:r>
-      <w:r>
-        <w:t xml:space="preserve"> au </w:t>
-      </w:r>
-      <w:r>
-        <w:t>{{</w:t>
-      </w:r>
-      <w:proofErr w:type="spellStart"/>
-      <w:r>
-        <w:t>analysis_end</w:t>
-      </w:r>
-      <w:proofErr w:type="spellEnd"/>
-      <w:r>
-        <w:t>}}</w:t>
-      </w:r>
-      <w:r>
-        <w:t xml:space="preserve">, à partir des informations fournies par le client. Le parc est composé de </w:t>
-      </w:r>
-      <w:r>
-        <w:t>{{</w:t>
-      </w:r>
-      <w:proofErr w:type="spellStart"/>
-      <w:r>
-        <w:t>turbine_count</w:t>
-      </w:r>
-      <w:proofErr w:type="spellEnd"/>
-      <w:r>
-        <w:t>}}</w:t>
-      </w:r>
-      <w:r>
-        <w:t xml:space="preserve"> éoliennes de type</w:t>
-      </w:r>
-      <w:r>
-        <w:t xml:space="preserve"> </w:t>
-      </w:r>
-      <w:r>
-        <w:t>{{</w:t>
-      </w:r>
-      <w:proofErr w:type="spellStart"/>
-      <w:r>
-        <w:t>model_wtg</w:t>
-      </w:r>
-      <w:proofErr w:type="spellEnd"/>
-      <w:r>
-        <w:t>}</w:t>
-      </w:r>
-      <w:r>
-        <w:t>}</w:t>
-      </w:r>
-      <w:r>
-        <w:t xml:space="preserve">, désignées </w:t>
-      </w:r>
-      <w:r>
-        <w:t>{{</w:t>
-      </w:r>
-      <w:proofErr w:type="spellStart"/>
-      <w:r>
-        <w:t>turbine_list</w:t>
-      </w:r>
-      <w:proofErr w:type="spellEnd"/>
-      <w:r>
-        <w:t>}}</w:t>
-      </w:r>
-      <w:r>
-        <w:t xml:space="preserve"> L’ensemble des turbines a été pris en compte dans l’analyse.</w:t>
-      </w:r>
-    </w:p>
-    <w:p>
-      <w:pPr>
-        <w:jc w:val="both"/>
-      </w:pPr>
-    </w:p>
-    <w:p>
-      <w:pPr>
-        <w:jc w:val="both"/>
-      </w:pPr>
-      <w:r>
-        <w:t>Le tableau ci-après présente une évaluation synthétique des performances du parc, en mettant en évidence, pour chaque indicateur, le niveau de performance de chaque éolienne ainsi que les éventuels écarts observés.</w:t>
-      </w:r>
-    </w:p>
-    <w:p/>
-    <w:p>
-      <w:r>
-        <w:t>[</w:t>
-      </w:r>
-      <w:proofErr w:type="gramStart"/>
-      <w:r>
-        <w:t>TABLE:SCADA</w:t>
-      </w:r>
-      <w:proofErr w:type="gramEnd"/>
-      <w:r>
-        <w:t>_SUMMARY_TABLE]</w:t>
-      </w:r>
-    </w:p>
-    <w:p>
-      <w:pPr>
-        <w:pStyle w:val="Titre1"/>
-      </w:pPr>
-      <w:r>
-        <w:t>Contexte de l’étude</w:t>
-      </w:r>
-    </w:p>
-    <w:p>
-      <w:pPr>
-        <w:pStyle w:val="Titre2"/>
-      </w:pPr>
-      <w:r>
-        <w:t>Présentation générale du parc</w:t>
-      </w:r>
-    </w:p>
-    <w:p>
-      <w:pPr>
-        <w:jc w:val="both"/>
-      </w:pPr>
-      <w:r>
-        <w:t>Le parc éolien {{</w:t>
-      </w:r>
-      <w:proofErr w:type="spellStart"/>
-      <w:r>
-        <w:t>park_name</w:t>
-      </w:r>
-      <w:proofErr w:type="spellEnd"/>
-      <w:r>
-        <w:t>}} est situé sur le territoire des communes de {{COMMUNES}}, dans la région de {{REGION}}. Il est composé de {{</w:t>
-      </w:r>
-      <w:proofErr w:type="spellStart"/>
-      <w:r>
-        <w:t>turbine_count</w:t>
-      </w:r>
-      <w:proofErr w:type="spellEnd"/>
-      <w:r>
-        <w:t>}} éoliennes de type {{</w:t>
-      </w:r>
-      <w:proofErr w:type="spellStart"/>
-      <w:r>
-        <w:t>model_wtg</w:t>
-      </w:r>
-      <w:proofErr w:type="spellEnd"/>
-      <w:r>
-        <w:t>}}, d’une puissance nominale unitaire de {{</w:t>
-      </w:r>
-      <w:proofErr w:type="spellStart"/>
-      <w:r>
-        <w:t>nominal_power</w:t>
-      </w:r>
-      <w:proofErr w:type="spellEnd"/>
-      <w:r>
-        <w:t>}}, soit une puissance totale installée de {{</w:t>
-      </w:r>
-      <w:proofErr w:type="spellStart"/>
-      <w:r>
-        <w:t>total_</w:t>
-      </w:r>
-      <w:proofErr w:type="gramStart"/>
-      <w:r>
-        <w:t>power</w:t>
-      </w:r>
-      <w:proofErr w:type="spellEnd"/>
-      <w:r>
-        <w:t xml:space="preserve"> </w:t>
-      </w:r>
-      <w:r>
-        <w:t>}</w:t>
-      </w:r>
-      <w:proofErr w:type="gramEnd"/>
-      <w:r>
-        <w:t>}.</w:t>
-      </w:r>
-    </w:p>
-    <w:p>
-      <w:pPr>
-        <w:jc w:val="both"/>
-      </w:pPr>
-      <w:r>
-        <w:t>Les éoliennes du parc sont identifiées comme suit : {{</w:t>
-      </w:r>
-      <w:proofErr w:type="spellStart"/>
-      <w:r>
-        <w:t>turbine_list</w:t>
-      </w:r>
-      <w:proofErr w:type="spellEnd"/>
-      <w:r>
-        <w:t xml:space="preserve">}}. L’implantation du parc et la disposition des éoliennes sont </w:t>
-      </w:r>
-      <w:proofErr w:type="spellStart"/>
-      <w:r>
-        <w:t>présen</w:t>
-      </w:r>
-      <w:proofErr w:type="spellEnd"/>
-      <w:r>
-        <w:t xml:space="preserve"> </w:t>
-      </w:r>
-      <w:proofErr w:type="spellStart"/>
-      <w:r>
-        <w:t>tées</w:t>
-      </w:r>
-      <w:proofErr w:type="spellEnd"/>
-      <w:r>
-        <w:t xml:space="preserve"> dans la figure ci-</w:t>
-      </w:r>
-      <w:r>
-        <w:t>après :</w:t>
-      </w:r>
-    </w:p>
-    <w:p>
-      <w:pPr>
-        <w:jc w:val="both"/>
-      </w:pPr>
-      <w:r>
-        <w:t>[TODO.IMAGE_POSITION]</w:t>
-      </w:r>
-    </w:p>
-    <w:p>
-      <w:r>
-        <w:t xml:space="preserve"> </w:t>
-      </w:r>
-    </w:p>
-    <w:p>
-      <w:pPr>
-        <w:pStyle w:val="Titre2"/>
-      </w:pPr>
-      <w:r>
-        <w:t>Coordonnées des éoliennes</w:t>
-      </w:r>
-    </w:p>
-    <w:p>
-      <w:r>
-        <w:t>Les coordonnées géographiques des éoliennes du parc sont présentées dans le tableau ci-dessous :</w:t>
-      </w:r>
-    </w:p>
-    <w:p>
-      <w:r>
-        <w:t>[TODO.TABLEAU COORDONNE GPS]</w:t>
-      </w:r>
-    </w:p>
-    <w:p>
-      <w:pPr>
-        <w:pStyle w:val="Titre2"/>
-      </w:pPr>
-      <w:r>
-        <w:t>Données fournies par le client</w:t>
-      </w:r>
-    </w:p>
-    <w:p>
-      <w:r>
-        <w:t>Dans le cadre de cette étude, plusieurs jeux de données ont été transmis par le client afin de permettre l’analyse des performances du parc éolien.</w:t>
-      </w:r>
-    </w:p>
-    <w:p>
-      <w:r>
-        <w:t>[</w:t>
-      </w:r>
-      <w:proofErr w:type="gramStart"/>
-      <w:r>
-        <w:t>TABLE:</w:t>
+        <w:t>T</w:t>
+      </w:r>
+      <w:r>
+        <w:t>ODO</w:t>
+      </w:r>
+      <w:r>
+        <w:t>:</w:t>
       </w:r>
       <w:proofErr w:type="gramEnd"/>
       <w:r>
@@ -2452,20 +2449,20 @@
     </w:p>
     <w:p>
       <w:r>
+        <w:t>•</w:t>
+      </w:r>
+      <w:r>
+        <w:tab/>
+        <w:t xml:space="preserve">la disponibilité moyenne des données SCADA sur la période d’analyse est de {{DISPO_SCADA}} % pour l’ensemble des éoliennes, </w:t>
+      </w:r>
+    </w:p>
+    <w:p>
+      <w:r>
         <w:lastRenderedPageBreak/>
         <w:t>•</w:t>
       </w:r>
       <w:r>
         <w:tab/>
-        <w:t xml:space="preserve">la disponibilité moyenne des données SCADA sur la période d’analyse est de {{DISPO_SCADA}} % pour l’ensemble des éoliennes, </w:t>
-      </w:r>
-    </w:p>
-    <w:p>
-      <w:r>
-        <w:t>•</w:t>
-      </w:r>
-      <w:r>
-        <w:tab/>
         <w:t xml:space="preserve">Ce niveau de disponibilité est considéré comme satisfaisant/NON Satisfaisant pour la réalisation d’une analyse de performance fiable. </w:t>
       </w:r>
     </w:p>
@@ -2496,7 +2493,19 @@
         <w:rPr>
           <w:lang w:val="en-US"/>
         </w:rPr>
-        <w:t>[TABLE:DATA_AVAILABILITY_TABLE]</w:t>
+        <w:t>[</w:t>
+      </w:r>
+      <w:r>
+        <w:rPr>
+          <w:lang w:val="en-US"/>
+        </w:rPr>
+        <w:t>TODO</w:t>
+      </w:r>
+      <w:r>
+        <w:rPr>
+          <w:lang w:val="en-US"/>
+        </w:rPr>
+        <w:t>:DATA_AVAILABILITY_TABLE]</w:t>
       </w:r>
     </w:p>
     <w:p>
@@ -2537,21 +2546,8 @@
       <w:pPr>
         <w:pStyle w:val="Titre2"/>
       </w:pPr>
-      <w:proofErr w:type="spellStart"/>
-      <w:r>
-        <w:t>Disp</w:t>
-      </w:r>
-      <w:proofErr w:type="spellEnd"/>
-      <w:r>
-        <w:t xml:space="preserve"> </w:t>
-      </w:r>
-      <w:proofErr w:type="spellStart"/>
-      <w:r>
-        <w:t>onibilité</w:t>
-      </w:r>
-      <w:proofErr w:type="spellEnd"/>
-      <w:r>
-        <w:t xml:space="preserve"> </w:t>
+      <w:r>
+        <w:t xml:space="preserve">Disponibilité </w:t>
       </w:r>
       <w:proofErr w:type="spellStart"/>
       <w:r>
@@ -2620,11 +2616,9 @@
           <w:numId w:val="7"/>
         </w:numPr>
       </w:pPr>
-      <w:proofErr w:type="gramStart"/>
-      <w:r>
-        <w:t>arrêts</w:t>
-      </w:r>
-      <w:proofErr w:type="gramEnd"/>
+      <w:r>
+        <w:t>Arrêts</w:t>
+      </w:r>
       <w:r>
         <w:t xml:space="preserve"> à la demande de l’exploitant, </w:t>
       </w:r>
@@ -2637,11 +2631,9 @@
           <w:numId w:val="7"/>
         </w:numPr>
       </w:pPr>
-      <w:proofErr w:type="gramStart"/>
-      <w:r>
-        <w:t>contraintes</w:t>
-      </w:r>
-      <w:proofErr w:type="gramEnd"/>
+      <w:r>
+        <w:t>Contraintes</w:t>
+      </w:r>
       <w:r>
         <w:t xml:space="preserve"> réseau, </w:t>
       </w:r>
@@ -2654,11 +2646,9 @@
           <w:numId w:val="7"/>
         </w:numPr>
       </w:pPr>
-      <w:proofErr w:type="gramStart"/>
-      <w:r>
-        <w:t>phénomènes</w:t>
-      </w:r>
-      <w:proofErr w:type="gramEnd"/>
+      <w:r>
+        <w:t>Phénomènes</w:t>
+      </w:r>
       <w:r>
         <w:t xml:space="preserve"> de givrage.</w:t>
       </w:r>
@@ -3594,6 +3584,25 @@
     <w:p>
       <w:r>
         <w:rPr>
+          <w:lang w:val="en-US"/>
+        </w:rPr>
+        <w:t>{{</w:t>
+      </w:r>
+      <w:proofErr w:type="spellStart"/>
+      <w:r>
+        <w:t>rpm_chart</w:t>
+      </w:r>
+      <w:proofErr w:type="spellEnd"/>
+      <w:r>
+        <w:rPr>
+          <w:lang w:val="en-US"/>
+        </w:rPr>
+        <w:t>}}</w:t>
+      </w:r>
+    </w:p>
+    <w:p>
+      <w:r>
+        <w:rPr>
           <w:highlight w:val="lightGray"/>
         </w:rPr>
         <w:t>[ANALYSE]</w:t>
@@ -3817,12 +3826,12 @@
     </w:p>
     <w:p>
       <w:r>
+        <w:lastRenderedPageBreak/>
         <w:t>[TODO.IMAGE LIMITE DE PUISSANCE]</w:t>
       </w:r>
     </w:p>
     <w:p>
       <w:r>
-        <w:lastRenderedPageBreak/>
         <w:t>[ANALYSE]</w:t>
       </w:r>
     </w:p>
@@ -6341,7 +6350,6 @@
   <w:style w:type="character" w:default="1" w:styleId="Policepardfaut">
     <w:name w:val="Default Paragraph Font"/>
     <w:uiPriority w:val="1"/>
-    <w:semiHidden/>
     <w:unhideWhenUsed/>
   </w:style>
   <w:style w:type="table" w:default="1" w:styleId="TableauNormal">

</xml_diff>

<commit_message>
[CHANGE] improve the code to handle error code
</commit_message>
<xml_diff>
--- a/assets/templates/template_scada.docx
+++ b/assets/templates/template_scada.docx
@@ -3018,6 +3018,7 @@
         <w:t>Sur la base de ces résultats, une analyse est conduite pour chaque code défaut significatif, en précisant les éoliennes concernées, la nature du défaut, son impact potentiel sur la disponibilité, et les recommandations associées.</w:t>
       </w:r>
     </w:p>
+    <w:p/>
     <w:p>
       <w:pPr>
         <w:rPr>
@@ -3042,8 +3043,27 @@
         <w:rPr>
           <w:lang w:val="en-US"/>
         </w:rPr>
-        <w:t>_CODES_TABLE]</w:t>
-      </w:r>
+        <w:t>_</w:t>
+      </w:r>
+      <w:r>
+        <w:rPr>
+          <w:lang w:val="en-US"/>
+        </w:rPr>
+        <w:t>CODE_</w:t>
+      </w:r>
+      <w:r>
+        <w:rPr>
+          <w:lang w:val="en-US"/>
+        </w:rPr>
+        <w:t>PARETO_FREQUENCY]</w:t>
+      </w:r>
+    </w:p>
+    <w:p>
+      <w:pPr>
+        <w:rPr>
+          <w:lang w:val="en-US"/>
+        </w:rPr>
+      </w:pPr>
     </w:p>
     <w:p>
       <w:pPr>
@@ -3073,15 +3093,29 @@
       </w:r>
     </w:p>
     <w:p>
-      <w:r>
+      <w:pPr>
+        <w:rPr>
+          <w:lang w:val="en-US"/>
+        </w:rPr>
+      </w:pPr>
+      <w:r>
+        <w:rPr>
+          <w:lang w:val="en-US"/>
+        </w:rPr>
         <w:t>{{</w:t>
       </w:r>
       <w:proofErr w:type="spellStart"/>
       <w:r>
+        <w:rPr>
+          <w:lang w:val="en-US"/>
+        </w:rPr>
         <w:t>treemap_error_code</w:t>
       </w:r>
       <w:proofErr w:type="spellEnd"/>
       <w:r>
+        <w:rPr>
+          <w:lang w:val="en-US"/>
+        </w:rPr>
         <w:t>}}</w:t>
       </w:r>
     </w:p>
@@ -3173,6 +3207,7 @@
     <w:p/>
     <w:p>
       <w:r>
+        <w:lastRenderedPageBreak/>
         <w:t>Les figures ci-après présentent les roses des vents pour chaque éolienne sur les périodes communes, ainsi que les biais directionnels moyens calculés, en relatif entre éoliennes et par rapport à la référence externe.</w:t>
       </w:r>
     </w:p>
@@ -3186,7 +3221,6 @@
         <w:rPr>
           <w:lang w:val="en-US"/>
         </w:rPr>
-        <w:lastRenderedPageBreak/>
         <w:t>[</w:t>
       </w:r>
       <w:proofErr w:type="gramStart"/>
@@ -3537,6 +3571,7 @@
     </w:p>
     <w:p>
       <w:r>
+        <w:lastRenderedPageBreak/>
         <w:t xml:space="preserve">L’analyse est réalisée sur l’ensemble de la période d’étude, avec une visualisation de l’évolution </w:t>
       </w:r>
       <w:r>
@@ -3558,7 +3593,6 @@
         </w:rPr>
       </w:pPr>
       <w:r>
-        <w:lastRenderedPageBreak/>
         <w:t xml:space="preserve"> </w:t>
       </w:r>
       <w:r>
@@ -3807,6 +3841,7 @@
     <w:p>
       <w:proofErr w:type="gramStart"/>
       <w:r>
+        <w:lastRenderedPageBreak/>
         <w:t>préciser</w:t>
       </w:r>
       <w:proofErr w:type="gramEnd"/>
@@ -3826,7 +3861,6 @@
     </w:p>
     <w:p>
       <w:r>
-        <w:lastRenderedPageBreak/>
         <w:t>[TODO.IMAGE LIMITE DE PUISSANCE]</w:t>
       </w:r>
     </w:p>
@@ -6350,6 +6384,7 @@
   <w:style w:type="character" w:default="1" w:styleId="Policepardfaut">
     <w:name w:val="Default Paragraph Font"/>
     <w:uiPriority w:val="1"/>
+    <w:semiHidden/>
     <w:unhideWhenUsed/>
   </w:style>
   <w:style w:type="table" w:default="1" w:styleId="TableauNormal">

</xml_diff>

<commit_message>
[CHANGE] change the code to handle error code
</commit_message>
<xml_diff>
--- a/assets/templates/template_scada.docx
+++ b/assets/templates/template_scada.docx
@@ -315,17 +315,8 @@
                 <w:b/>
                 <w:bCs/>
               </w:rPr>
-              <w:t xml:space="preserve">Date </w:t>
+              <w:t>Date d’émission</w:t>
             </w:r>
-            <w:proofErr w:type="spellStart"/>
-            <w:r>
-              <w:rPr>
-                <w:b/>
-                <w:bCs/>
-              </w:rPr>
-              <w:t>d’émission</w:t>
-            </w:r>
-            <w:proofErr w:type="spellEnd"/>
           </w:p>
         </w:tc>
         <w:tc>
@@ -361,7 +352,6 @@
                 <w:bCs/>
               </w:rPr>
             </w:pPr>
-            <w:proofErr w:type="spellStart"/>
             <w:r>
               <w:rPr>
                 <w:b/>
@@ -369,7 +359,6 @@
               </w:rPr>
               <w:t>Rédacteur</w:t>
             </w:r>
-            <w:proofErr w:type="spellEnd"/>
           </w:p>
         </w:tc>
         <w:tc>
@@ -384,7 +373,6 @@
                 <w:bCs/>
               </w:rPr>
             </w:pPr>
-            <w:proofErr w:type="spellStart"/>
             <w:r>
               <w:rPr>
                 <w:b/>
@@ -392,7 +380,6 @@
               </w:rPr>
               <w:t>Vérificateur</w:t>
             </w:r>
-            <w:proofErr w:type="spellEnd"/>
           </w:p>
         </w:tc>
         <w:tc>
@@ -407,7 +394,6 @@
                 <w:bCs/>
               </w:rPr>
             </w:pPr>
-            <w:proofErr w:type="spellStart"/>
             <w:r>
               <w:rPr>
                 <w:b/>
@@ -415,7 +401,6 @@
               </w:rPr>
               <w:t>Approbateur</w:t>
             </w:r>
-            <w:proofErr w:type="spellEnd"/>
           </w:p>
         </w:tc>
       </w:tr>
@@ -989,11 +974,9 @@
         <w:lastRenderedPageBreak/>
         <w:t>Nom du parc : {{</w:t>
       </w:r>
-      <w:proofErr w:type="spellStart"/>
       <w:r>
         <w:t>park_name</w:t>
       </w:r>
-      <w:proofErr w:type="spellEnd"/>
       <w:r>
         <w:t xml:space="preserve">}} </w:t>
       </w:r>
@@ -1002,161 +985,263 @@
       <w:r>
         <w:t>Type d’éoliennes : {{</w:t>
       </w:r>
-      <w:proofErr w:type="spellStart"/>
       <w:r>
         <w:t>model_wtg</w:t>
       </w:r>
-      <w:proofErr w:type="spellEnd"/>
       <w:r>
         <w:t xml:space="preserve">}} </w:t>
       </w:r>
     </w:p>
     <w:p>
       <w:r>
-        <w:t>Nombre d’éoliennes : {{</w:t>
-      </w:r>
-      <w:proofErr w:type="spellStart"/>
-      <w:r>
-        <w:t>N</w:t>
+        <w:t>Nombre d’éoliennes : {{N</w:t>
       </w:r>
       <w:r>
         <w:t>ombre</w:t>
       </w:r>
       <w:r>
-        <w:t>_WTG</w:t>
-      </w:r>
-      <w:proofErr w:type="spellEnd"/>
+        <w:t xml:space="preserve">_WTG}} </w:t>
+      </w:r>
+    </w:p>
+    <w:p>
+      <w:r>
+        <w:t>Puissance totale installée : {{</w:t>
+      </w:r>
+      <w:r>
+        <w:t>nominal_power</w:t>
+      </w:r>
       <w:r>
         <w:t xml:space="preserve">}} </w:t>
       </w:r>
     </w:p>
     <w:p>
       <w:r>
-        <w:t>Puissance totale installée : {{</w:t>
-      </w:r>
-      <w:proofErr w:type="spellStart"/>
+        <w:t xml:space="preserve">Localisation : {{LOCALISATION}} </w:t>
+      </w:r>
+    </w:p>
+    <w:p>
+      <w:r>
+        <w:t>Client : {{CLIENT}}</w:t>
+      </w:r>
+    </w:p>
+    <w:p>
+      <w:r>
+        <w:t xml:space="preserve">Contact : {{CONTACT_CLIENT}} </w:t>
+      </w:r>
+    </w:p>
+    <w:p>
+      <w:r>
+        <w:t xml:space="preserve">Constructeur / Exploitant : {{CONTRACTOR}} </w:t>
+      </w:r>
+    </w:p>
+    <w:p/>
+    <w:p>
+      <w:r>
+        <w:t>Rédacteur</w:t>
+      </w:r>
+    </w:p>
+    <w:p>
+      <w:r>
+        <w:t>{{AUTEUR}}</w:t>
+      </w:r>
+    </w:p>
+    <w:p>
+      <w:r>
+        <w:t>Email : {{MAIL_AUTEUR}}</w:t>
+      </w:r>
+    </w:p>
+    <w:p>
+      <w:r>
+        <w:t>Téléphone : {{TEL_AUTEUR}}</w:t>
+      </w:r>
+    </w:p>
+    <w:p/>
+    <w:p>
+      <w:r>
+        <w:t>Vérificateur</w:t>
+      </w:r>
+    </w:p>
+    <w:p>
+      <w:r>
+        <w:t>{{VERIFICATEUR}}</w:t>
+      </w:r>
+    </w:p>
+    <w:p>
+      <w:r>
+        <w:t>Email : {{MAIL_VERIFICATEUR}}</w:t>
+      </w:r>
+    </w:p>
+    <w:p>
+      <w:r>
+        <w:t>Téléphone : {{TEL_VERIFICATEUR}}</w:t>
+      </w:r>
+    </w:p>
+    <w:p/>
+    <w:p>
+      <w:r>
+        <w:t>Approbateur</w:t>
+      </w:r>
+    </w:p>
+    <w:p>
+      <w:r>
+        <w:t>{{APPROBATEUR}}</w:t>
+      </w:r>
+    </w:p>
+    <w:p>
+      <w:r>
+        <w:t>Email : {{MAIL_APPROBATEUR}}</w:t>
+      </w:r>
+    </w:p>
+    <w:p>
+      <w:r>
+        <w:t>Téléphone : {{TEL_APPROBATEUR}}</w:t>
+      </w:r>
+    </w:p>
+    <w:p/>
+    <w:p>
+      <w:pPr>
+        <w:spacing w:after="160" w:line="259" w:lineRule="auto"/>
+      </w:pPr>
+      <w:r>
+        <w:br w:type="page"/>
+      </w:r>
+    </w:p>
+    <w:p/>
+    <w:p>
+      <w:pPr>
+        <w:pStyle w:val="Titre1"/>
+      </w:pPr>
+      <w:r>
+        <w:t>Synthèse</w:t>
+      </w:r>
+    </w:p>
+    <w:p>
+      <w:pPr>
+        <w:jc w:val="both"/>
+      </w:pPr>
+      <w:r>
+        <w:t xml:space="preserve">Les données SCADA du parc éolien </w:t>
+      </w:r>
+      <w:r>
+        <w:t>{{park_name}}</w:t>
+      </w:r>
+      <w:r>
+        <w:t xml:space="preserve"> ont été analysées sur la période du </w:t>
+      </w:r>
+      <w:r>
+        <w:t>{{analysis_start}}</w:t>
+      </w:r>
+      <w:r>
+        <w:t xml:space="preserve"> au </w:t>
+      </w:r>
+      <w:r>
+        <w:t>{{analysis_end}}</w:t>
+      </w:r>
+      <w:r>
+        <w:t xml:space="preserve">, à partir des informations fournies par le client. Le parc est composé de </w:t>
+      </w:r>
+      <w:r>
+        <w:t>{{turbine_count}}</w:t>
+      </w:r>
+      <w:r>
+        <w:t xml:space="preserve"> éoliennes de type</w:t>
+      </w:r>
+      <w:r>
+        <w:t xml:space="preserve"> </w:t>
+      </w:r>
+      <w:r>
+        <w:t>{{model_wtg}</w:t>
+      </w:r>
+      <w:r>
+        <w:t>}</w:t>
+      </w:r>
+      <w:r>
+        <w:t xml:space="preserve">, désignées </w:t>
+      </w:r>
+      <w:r>
+        <w:t>{{turbine_list}}</w:t>
+      </w:r>
+      <w:r>
+        <w:t xml:space="preserve"> L’ensemble des turbines a été pris en compte dans l’analyse.</w:t>
+      </w:r>
+    </w:p>
+    <w:p>
+      <w:pPr>
+        <w:jc w:val="both"/>
+      </w:pPr>
+    </w:p>
+    <w:p>
+      <w:pPr>
+        <w:jc w:val="both"/>
+      </w:pPr>
+      <w:r>
+        <w:t>Le tableau ci-après présente une évaluation synthétique des performances du parc, en mettant en évidence, pour chaque indicateur, le niveau de performance de chaque éolienne ainsi que les éventuels écarts observés.</w:t>
+      </w:r>
+    </w:p>
+    <w:p/>
+    <w:p>
+      <w:r>
+        <w:t>[T</w:t>
+      </w:r>
+      <w:r>
+        <w:t>ODO</w:t>
+      </w:r>
+      <w:r>
+        <w:t>:SCADA_SUMMARY_TABLE]</w:t>
+      </w:r>
+    </w:p>
+    <w:p>
+      <w:pPr>
+        <w:pStyle w:val="Titre1"/>
+      </w:pPr>
+      <w:r>
+        <w:t>Contexte de l’étude</w:t>
+      </w:r>
+    </w:p>
+    <w:p>
+      <w:pPr>
+        <w:pStyle w:val="Titre2"/>
+      </w:pPr>
+      <w:r>
+        <w:t>Présentation générale du parc</w:t>
+      </w:r>
+    </w:p>
+    <w:p>
+      <w:pPr>
+        <w:jc w:val="both"/>
+      </w:pPr>
+      <w:r>
+        <w:t>Le parc éolien {{</w:t>
+      </w:r>
+      <w:r>
+        <w:t>park_name</w:t>
+      </w:r>
+      <w:r>
+        <w:t>}} est situé sur le territoire des communes de {{COMMUNES}}, dans la région de {{REGION}}. Il est composé de {{</w:t>
+      </w:r>
+      <w:r>
+        <w:t>turbine_count</w:t>
+      </w:r>
+      <w:r>
+        <w:t>}} éoliennes de type {{</w:t>
+      </w:r>
+      <w:r>
+        <w:t>model_wtg</w:t>
+      </w:r>
+      <w:r>
+        <w:t>}}, d’une puissance nominale unitaire de {{</w:t>
+      </w:r>
       <w:r>
         <w:t>nominal_power</w:t>
       </w:r>
-      <w:proofErr w:type="spellEnd"/>
-      <w:r>
-        <w:t xml:space="preserve">}} </w:t>
-      </w:r>
-    </w:p>
-    <w:p>
-      <w:r>
-        <w:t xml:space="preserve">Localisation : {{LOCALISATION}} </w:t>
-      </w:r>
-    </w:p>
-    <w:p>
-      <w:r>
-        <w:t>Client : {{CLIENT}}</w:t>
-      </w:r>
-    </w:p>
-    <w:p>
-      <w:r>
-        <w:t xml:space="preserve">Contact : {{CONTACT_CLIENT}} </w:t>
-      </w:r>
-    </w:p>
-    <w:p>
-      <w:r>
-        <w:t xml:space="preserve">Constructeur / Exploitant : {{CONTRACTOR}} </w:t>
-      </w:r>
-    </w:p>
-    <w:p/>
-    <w:p>
-      <w:r>
-        <w:t>Rédacteur</w:t>
-      </w:r>
-    </w:p>
-    <w:p>
-      <w:r>
-        <w:t>{{AUTEUR}}</w:t>
-      </w:r>
-    </w:p>
-    <w:p>
-      <w:proofErr w:type="gramStart"/>
-      <w:r>
-        <w:t>Email</w:t>
-      </w:r>
-      <w:proofErr w:type="gramEnd"/>
-      <w:r>
-        <w:t xml:space="preserve"> : {{MAIL_AUTEUR}}</w:t>
-      </w:r>
-    </w:p>
-    <w:p>
-      <w:r>
-        <w:t>Téléphone : {{TEL_AUTEUR}}</w:t>
-      </w:r>
-    </w:p>
-    <w:p/>
-    <w:p>
-      <w:r>
-        <w:t>Vérificateur</w:t>
-      </w:r>
-    </w:p>
-    <w:p>
-      <w:r>
-        <w:t>{{VERIFICATEUR}}</w:t>
-      </w:r>
-    </w:p>
-    <w:p>
-      <w:proofErr w:type="gramStart"/>
-      <w:r>
-        <w:t>Email</w:t>
-      </w:r>
-      <w:proofErr w:type="gramEnd"/>
-      <w:r>
-        <w:t xml:space="preserve"> : {{MAIL_VERIFICATEUR}}</w:t>
-      </w:r>
-    </w:p>
-    <w:p>
-      <w:r>
-        <w:t>Téléphone : {{TEL_VERIFICATEUR}}</w:t>
-      </w:r>
-    </w:p>
-    <w:p/>
-    <w:p>
-      <w:r>
-        <w:t>Approbateur</w:t>
-      </w:r>
-    </w:p>
-    <w:p>
-      <w:r>
-        <w:t>{{APPROBATEUR}}</w:t>
-      </w:r>
-    </w:p>
-    <w:p>
-      <w:proofErr w:type="gramStart"/>
-      <w:r>
-        <w:t>Email</w:t>
-      </w:r>
-      <w:proofErr w:type="gramEnd"/>
-      <w:r>
-        <w:t xml:space="preserve"> : {{MAIL_APPROBATEUR}}</w:t>
-      </w:r>
-    </w:p>
-    <w:p>
-      <w:r>
-        <w:t>Téléphone : {{TEL_APPROBATEUR}}</w:t>
-      </w:r>
-    </w:p>
-    <w:p/>
-    <w:p>
-      <w:pPr>
-        <w:spacing w:after="160" w:line="259" w:lineRule="auto"/>
-      </w:pPr>
-      <w:r>
-        <w:br w:type="page"/>
-      </w:r>
-    </w:p>
-    <w:p/>
-    <w:p>
-      <w:pPr>
-        <w:pStyle w:val="Titre1"/>
-      </w:pPr>
-      <w:r>
-        <w:t>Synthèse</w:t>
+      <w:r>
+        <w:t>}}, soit une puissance totale installée de {{</w:t>
+      </w:r>
+      <w:r>
+        <w:t xml:space="preserve">total_power </w:t>
+      </w:r>
+      <w:r>
+        <w:t>}}.</w:t>
       </w:r>
     </w:p>
     <w:p>
@@ -1164,303 +1249,71 @@
         <w:jc w:val="both"/>
       </w:pPr>
       <w:r>
-        <w:t xml:space="preserve">Les données SCADA du parc éolien </w:t>
-      </w:r>
-      <w:r>
-        <w:t>{{</w:t>
-      </w:r>
-      <w:proofErr w:type="spellStart"/>
-      <w:r>
-        <w:t>park_name</w:t>
-      </w:r>
-      <w:proofErr w:type="spellEnd"/>
-      <w:r>
-        <w:t>}}</w:t>
-      </w:r>
-      <w:r>
-        <w:t xml:space="preserve"> ont été analysées sur la période du </w:t>
-      </w:r>
-      <w:r>
-        <w:t>{{</w:t>
-      </w:r>
-      <w:proofErr w:type="spellStart"/>
-      <w:r>
-        <w:t>analysis_start</w:t>
-      </w:r>
-      <w:proofErr w:type="spellEnd"/>
-      <w:r>
-        <w:t>}}</w:t>
-      </w:r>
-      <w:r>
-        <w:t xml:space="preserve"> au </w:t>
-      </w:r>
-      <w:r>
-        <w:t>{{</w:t>
-      </w:r>
-      <w:proofErr w:type="spellStart"/>
-      <w:r>
-        <w:t>analysis_end</w:t>
-      </w:r>
-      <w:proofErr w:type="spellEnd"/>
-      <w:r>
-        <w:t>}}</w:t>
-      </w:r>
-      <w:r>
-        <w:t xml:space="preserve">, à partir des informations fournies par le client. Le parc est composé de </w:t>
-      </w:r>
-      <w:r>
-        <w:t>{{</w:t>
-      </w:r>
-      <w:proofErr w:type="spellStart"/>
-      <w:r>
-        <w:t>turbine_count</w:t>
-      </w:r>
-      <w:proofErr w:type="spellEnd"/>
-      <w:r>
-        <w:t>}}</w:t>
-      </w:r>
-      <w:r>
-        <w:t xml:space="preserve"> éoliennes de type</w:t>
-      </w:r>
+        <w:t>Les éoliennes du parc sont identifiées comme suit : {{</w:t>
+      </w:r>
+      <w:r>
+        <w:t>turbine_list</w:t>
+      </w:r>
+      <w:r>
+        <w:t>}}. L’implantation du parc et la disposition des éoliennes sont présen tées dans la figure ci-</w:t>
+      </w:r>
+      <w:r>
+        <w:t>après :</w:t>
+      </w:r>
+    </w:p>
+    <w:p>
+      <w:pPr>
+        <w:jc w:val="both"/>
+      </w:pPr>
+      <w:r>
+        <w:t>[TODO.IMAGE_POSITION]</w:t>
+      </w:r>
+    </w:p>
+    <w:p>
       <w:r>
         <w:t xml:space="preserve"> </w:t>
       </w:r>
-      <w:r>
-        <w:t>{{</w:t>
-      </w:r>
-      <w:proofErr w:type="spellStart"/>
-      <w:r>
-        <w:t>model_wtg</w:t>
-      </w:r>
-      <w:proofErr w:type="spellEnd"/>
-      <w:r>
-        <w:t>}</w:t>
-      </w:r>
-      <w:r>
-        <w:t>}</w:t>
-      </w:r>
-      <w:r>
-        <w:t xml:space="preserve">, désignées </w:t>
-      </w:r>
-      <w:r>
-        <w:t>{{</w:t>
-      </w:r>
-      <w:proofErr w:type="spellStart"/>
-      <w:r>
-        <w:t>turbine_list</w:t>
-      </w:r>
-      <w:proofErr w:type="spellEnd"/>
-      <w:r>
-        <w:t>}}</w:t>
-      </w:r>
-      <w:r>
-        <w:t xml:space="preserve"> L’ensemble des turbines a été pris en compte dans l’analyse.</w:t>
-      </w:r>
-    </w:p>
-    <w:p>
-      <w:pPr>
-        <w:jc w:val="both"/>
-      </w:pPr>
-    </w:p>
-    <w:p>
-      <w:pPr>
-        <w:jc w:val="both"/>
-      </w:pPr>
-      <w:r>
-        <w:t>Le tableau ci-après présente une évaluation synthétique des performances du parc, en mettant en évidence, pour chaque indicateur, le niveau de performance de chaque éolienne ainsi que les éventuels écarts observés.</w:t>
-      </w:r>
-    </w:p>
-    <w:p/>
-    <w:p>
-      <w:r>
-        <w:t>[</w:t>
-      </w:r>
-      <w:proofErr w:type="gramStart"/>
-      <w:r>
-        <w:t>T</w:t>
+    </w:p>
+    <w:p>
+      <w:pPr>
+        <w:pStyle w:val="Titre2"/>
+      </w:pPr>
+      <w:r>
+        <w:t>Coordonnées des éoliennes</w:t>
+      </w:r>
+    </w:p>
+    <w:p>
+      <w:r>
+        <w:t>Les coordonnées géographiques des éoliennes du parc sont présentées dans le tableau ci-dessous :</w:t>
+      </w:r>
+    </w:p>
+    <w:p>
+      <w:r>
+        <w:t>[TODO.TABLEAU COORDONNE GPS]</w:t>
+      </w:r>
+    </w:p>
+    <w:p>
+      <w:pPr>
+        <w:pStyle w:val="Titre2"/>
+      </w:pPr>
+      <w:r>
+        <w:t>Données fournies par le client</w:t>
+      </w:r>
+    </w:p>
+    <w:p>
+      <w:r>
+        <w:t>Dans le cadre de cette étude, plusieurs jeux de données ont été transmis par le client afin de permettre l’analyse des performances du parc éolien.</w:t>
+      </w:r>
+    </w:p>
+    <w:p>
+      <w:r>
+        <w:t>[T</w:t>
       </w:r>
       <w:r>
         <w:t>ODO</w:t>
       </w:r>
       <w:r>
-        <w:t>:SCADA</w:t>
-      </w:r>
-      <w:proofErr w:type="gramEnd"/>
-      <w:r>
-        <w:t>_SUMMARY_TABLE]</w:t>
-      </w:r>
-    </w:p>
-    <w:p>
-      <w:pPr>
-        <w:pStyle w:val="Titre1"/>
-      </w:pPr>
-      <w:r>
-        <w:t>Contexte de l’étude</w:t>
-      </w:r>
-    </w:p>
-    <w:p>
-      <w:pPr>
-        <w:pStyle w:val="Titre2"/>
-      </w:pPr>
-      <w:r>
-        <w:t>Présentation générale du parc</w:t>
-      </w:r>
-    </w:p>
-    <w:p>
-      <w:pPr>
-        <w:jc w:val="both"/>
-      </w:pPr>
-      <w:r>
-        <w:t>Le parc éolien {{</w:t>
-      </w:r>
-      <w:proofErr w:type="spellStart"/>
-      <w:r>
-        <w:t>park_name</w:t>
-      </w:r>
-      <w:proofErr w:type="spellEnd"/>
-      <w:r>
-        <w:t>}} est situé sur le territoire des communes de {{COMMUNES}}, dans la région de {{REGION}}. Il est composé de {{</w:t>
-      </w:r>
-      <w:proofErr w:type="spellStart"/>
-      <w:r>
-        <w:t>turbine_count</w:t>
-      </w:r>
-      <w:proofErr w:type="spellEnd"/>
-      <w:r>
-        <w:t>}} éoliennes de type {{</w:t>
-      </w:r>
-      <w:proofErr w:type="spellStart"/>
-      <w:r>
-        <w:t>model_wtg</w:t>
-      </w:r>
-      <w:proofErr w:type="spellEnd"/>
-      <w:r>
-        <w:t>}}, d’une puissance nominale unitaire de {{</w:t>
-      </w:r>
-      <w:proofErr w:type="spellStart"/>
-      <w:r>
-        <w:t>nominal_power</w:t>
-      </w:r>
-      <w:proofErr w:type="spellEnd"/>
-      <w:r>
-        <w:t>}}, soit une puissance totale installée de {{</w:t>
-      </w:r>
-      <w:proofErr w:type="spellStart"/>
-      <w:r>
-        <w:t>total_</w:t>
-      </w:r>
-      <w:proofErr w:type="gramStart"/>
-      <w:r>
-        <w:t>power</w:t>
-      </w:r>
-      <w:proofErr w:type="spellEnd"/>
-      <w:r>
-        <w:t xml:space="preserve"> </w:t>
-      </w:r>
-      <w:r>
-        <w:t>}</w:t>
-      </w:r>
-      <w:proofErr w:type="gramEnd"/>
-      <w:r>
-        <w:t>}.</w:t>
-      </w:r>
-    </w:p>
-    <w:p>
-      <w:pPr>
-        <w:jc w:val="both"/>
-      </w:pPr>
-      <w:r>
-        <w:t>Les éoliennes du parc sont identifiées comme suit : {{</w:t>
-      </w:r>
-      <w:proofErr w:type="spellStart"/>
-      <w:r>
-        <w:t>turbine_list</w:t>
-      </w:r>
-      <w:proofErr w:type="spellEnd"/>
-      <w:r>
-        <w:t xml:space="preserve">}}. L’implantation du parc et la disposition des éoliennes sont </w:t>
-      </w:r>
-      <w:proofErr w:type="spellStart"/>
-      <w:r>
-        <w:t>présen</w:t>
-      </w:r>
-      <w:proofErr w:type="spellEnd"/>
-      <w:r>
-        <w:t xml:space="preserve"> </w:t>
-      </w:r>
-      <w:proofErr w:type="spellStart"/>
-      <w:r>
-        <w:t>tées</w:t>
-      </w:r>
-      <w:proofErr w:type="spellEnd"/>
-      <w:r>
-        <w:t xml:space="preserve"> dans la figure ci-</w:t>
-      </w:r>
-      <w:r>
-        <w:t>après :</w:t>
-      </w:r>
-    </w:p>
-    <w:p>
-      <w:pPr>
-        <w:jc w:val="both"/>
-      </w:pPr>
-      <w:r>
-        <w:t>[TODO.IMAGE_POSITION]</w:t>
-      </w:r>
-    </w:p>
-    <w:p>
-      <w:r>
-        <w:t xml:space="preserve"> </w:t>
-      </w:r>
-    </w:p>
-    <w:p>
-      <w:pPr>
-        <w:pStyle w:val="Titre2"/>
-      </w:pPr>
-      <w:r>
-        <w:t>Coordonnées des éoliennes</w:t>
-      </w:r>
-    </w:p>
-    <w:p>
-      <w:r>
-        <w:t>Les coordonnées géographiques des éoliennes du parc sont présentées dans le tableau ci-dessous :</w:t>
-      </w:r>
-    </w:p>
-    <w:p>
-      <w:r>
-        <w:t>[TODO.TABLEAU COORDONNE GPS]</w:t>
-      </w:r>
-    </w:p>
-    <w:p>
-      <w:pPr>
-        <w:pStyle w:val="Titre2"/>
-      </w:pPr>
-      <w:r>
-        <w:t>Données fournies par le client</w:t>
-      </w:r>
-    </w:p>
-    <w:p>
-      <w:r>
-        <w:t>Dans le cadre de cette étude, plusieurs jeux de données ont été transmis par le client afin de permettre l’analyse des performances du parc éolien.</w:t>
-      </w:r>
-    </w:p>
-    <w:p>
-      <w:r>
-        <w:t>[</w:t>
-      </w:r>
-      <w:proofErr w:type="gramStart"/>
-      <w:r>
-        <w:t>T</w:t>
-      </w:r>
-      <w:r>
-        <w:t>ODO</w:t>
-      </w:r>
-      <w:r>
-        <w:t>:</w:t>
-      </w:r>
-      <w:proofErr w:type="gramEnd"/>
-      <w:r>
-        <w:t>CSV_FILES_TABLE]</w:t>
+        <w:t>:CSV_FILES_TABLE]</w:t>
       </w:r>
     </w:p>
     <w:p>
@@ -1507,7 +1360,6 @@
                 <w:szCs w:val="22"/>
               </w:rPr>
             </w:pPr>
-            <w:proofErr w:type="spellStart"/>
             <w:r>
               <w:rPr>
                 <w:rFonts w:ascii="Cambria" w:eastAsia="MS Mincho" w:hAnsi="Cambria"/>
@@ -1544,7 +1396,6 @@
               </w:rPr>
               <w:t>e</w:t>
             </w:r>
-            <w:proofErr w:type="spellEnd"/>
           </w:p>
         </w:tc>
         <w:tc>
@@ -1568,18 +1419,8 @@
                 <w:sz w:val="22"/>
                 <w:szCs w:val="22"/>
               </w:rPr>
-              <w:t xml:space="preserve">Axes </w:t>
+              <w:t>Axes d’analyse</w:t>
             </w:r>
-            <w:proofErr w:type="spellStart"/>
-            <w:r>
-              <w:rPr>
-                <w:rFonts w:ascii="Cambria" w:eastAsia="MS Mincho" w:hAnsi="Cambria"/>
-                <w:sz w:val="22"/>
-                <w:szCs w:val="22"/>
-              </w:rPr>
-              <w:t>d’analyse</w:t>
-            </w:r>
-            <w:proofErr w:type="spellEnd"/>
           </w:p>
         </w:tc>
       </w:tr>
@@ -1599,23 +1440,13 @@
                 <w:szCs w:val="22"/>
               </w:rPr>
             </w:pPr>
-            <w:proofErr w:type="spellStart"/>
             <w:r>
               <w:rPr>
                 <w:rFonts w:ascii="Cambria" w:eastAsia="MS Mincho" w:hAnsi="Cambria"/>
                 <w:sz w:val="22"/>
                 <w:szCs w:val="22"/>
               </w:rPr>
-              <w:t>Qualité</w:t>
-            </w:r>
-            <w:proofErr w:type="spellEnd"/>
-            <w:r>
-              <w:rPr>
-                <w:rFonts w:ascii="Cambria" w:eastAsia="MS Mincho" w:hAnsi="Cambria"/>
-                <w:sz w:val="22"/>
-                <w:szCs w:val="22"/>
-              </w:rPr>
-              <w:t xml:space="preserve"> des données</w:t>
+              <w:t>Qualité des données</w:t>
             </w:r>
           </w:p>
         </w:tc>
@@ -1699,18 +1530,8 @@
                 <w:sz w:val="22"/>
                 <w:szCs w:val="22"/>
               </w:rPr>
-              <w:t xml:space="preserve">Production et </w:t>
+              <w:t>Production et disponibilité</w:t>
             </w:r>
-            <w:proofErr w:type="spellStart"/>
-            <w:r>
-              <w:rPr>
-                <w:rFonts w:ascii="Cambria" w:eastAsia="MS Mincho" w:hAnsi="Cambria"/>
-                <w:sz w:val="22"/>
-                <w:szCs w:val="22"/>
-              </w:rPr>
-              <w:t>disponibilité</w:t>
-            </w:r>
-            <w:proofErr w:type="spellEnd"/>
           </w:p>
         </w:tc>
         <w:tc>
@@ -1732,52 +1553,14 @@
                 <w:szCs w:val="22"/>
               </w:rPr>
             </w:pPr>
-            <w:proofErr w:type="spellStart"/>
             <w:r>
               <w:rPr>
                 <w:rFonts w:ascii="Cambria" w:eastAsia="MS Mincho" w:hAnsi="Cambria"/>
                 <w:sz w:val="22"/>
                 <w:szCs w:val="22"/>
               </w:rPr>
-              <w:t>Calcul</w:t>
+              <w:t>Calcul de la disponibilité énergétique</w:t>
             </w:r>
-            <w:proofErr w:type="spellEnd"/>
-            <w:r>
-              <w:rPr>
-                <w:rFonts w:ascii="Cambria" w:eastAsia="MS Mincho" w:hAnsi="Cambria"/>
-                <w:sz w:val="22"/>
-                <w:szCs w:val="22"/>
-              </w:rPr>
-              <w:t xml:space="preserve"> de la </w:t>
-            </w:r>
-            <w:proofErr w:type="spellStart"/>
-            <w:r>
-              <w:rPr>
-                <w:rFonts w:ascii="Cambria" w:eastAsia="MS Mincho" w:hAnsi="Cambria"/>
-                <w:sz w:val="22"/>
-                <w:szCs w:val="22"/>
-              </w:rPr>
-              <w:t>disponibilité</w:t>
-            </w:r>
-            <w:proofErr w:type="spellEnd"/>
-            <w:r>
-              <w:rPr>
-                <w:rFonts w:ascii="Cambria" w:eastAsia="MS Mincho" w:hAnsi="Cambria"/>
-                <w:sz w:val="22"/>
-                <w:szCs w:val="22"/>
-              </w:rPr>
-              <w:t xml:space="preserve"> </w:t>
-            </w:r>
-            <w:proofErr w:type="spellStart"/>
-            <w:r>
-              <w:rPr>
-                <w:rFonts w:ascii="Cambria" w:eastAsia="MS Mincho" w:hAnsi="Cambria"/>
-                <w:sz w:val="22"/>
-                <w:szCs w:val="22"/>
-              </w:rPr>
-              <w:t>énergétique</w:t>
-            </w:r>
-            <w:proofErr w:type="spellEnd"/>
           </w:p>
           <w:p>
             <w:pPr>
@@ -1794,52 +1577,14 @@
                 <w:szCs w:val="22"/>
               </w:rPr>
             </w:pPr>
-            <w:proofErr w:type="spellStart"/>
             <w:r>
               <w:rPr>
                 <w:rFonts w:ascii="Cambria" w:eastAsia="MS Mincho" w:hAnsi="Cambria"/>
                 <w:sz w:val="22"/>
                 <w:szCs w:val="22"/>
               </w:rPr>
-              <w:t>Calcul</w:t>
+              <w:t>Calcul de la disponibilité temporelle</w:t>
             </w:r>
-            <w:proofErr w:type="spellEnd"/>
-            <w:r>
-              <w:rPr>
-                <w:rFonts w:ascii="Cambria" w:eastAsia="MS Mincho" w:hAnsi="Cambria"/>
-                <w:sz w:val="22"/>
-                <w:szCs w:val="22"/>
-              </w:rPr>
-              <w:t xml:space="preserve"> de la </w:t>
-            </w:r>
-            <w:proofErr w:type="spellStart"/>
-            <w:r>
-              <w:rPr>
-                <w:rFonts w:ascii="Cambria" w:eastAsia="MS Mincho" w:hAnsi="Cambria"/>
-                <w:sz w:val="22"/>
-                <w:szCs w:val="22"/>
-              </w:rPr>
-              <w:t>disponibilité</w:t>
-            </w:r>
-            <w:proofErr w:type="spellEnd"/>
-            <w:r>
-              <w:rPr>
-                <w:rFonts w:ascii="Cambria" w:eastAsia="MS Mincho" w:hAnsi="Cambria"/>
-                <w:sz w:val="22"/>
-                <w:szCs w:val="22"/>
-              </w:rPr>
-              <w:t xml:space="preserve"> </w:t>
-            </w:r>
-            <w:proofErr w:type="spellStart"/>
-            <w:r>
-              <w:rPr>
-                <w:rFonts w:ascii="Cambria" w:eastAsia="MS Mincho" w:hAnsi="Cambria"/>
-                <w:sz w:val="22"/>
-                <w:szCs w:val="22"/>
-              </w:rPr>
-              <w:t>temporelle</w:t>
-            </w:r>
-            <w:proofErr w:type="spellEnd"/>
           </w:p>
           <w:p>
             <w:pPr>
@@ -1911,41 +1656,13 @@
                 <w:szCs w:val="22"/>
               </w:rPr>
             </w:pPr>
-            <w:proofErr w:type="spellStart"/>
             <w:r>
               <w:rPr>
                 <w:rFonts w:ascii="Cambria" w:eastAsia="MS Mincho" w:hAnsi="Cambria"/>
                 <w:sz w:val="22"/>
                 <w:szCs w:val="22"/>
               </w:rPr>
-              <w:t>Bridages</w:t>
-            </w:r>
-            <w:proofErr w:type="spellEnd"/>
-            <w:r>
-              <w:rPr>
-                <w:rFonts w:ascii="Cambria" w:eastAsia="MS Mincho" w:hAnsi="Cambria"/>
-                <w:sz w:val="22"/>
-                <w:szCs w:val="22"/>
-              </w:rPr>
-              <w:t xml:space="preserve"> (</w:t>
-            </w:r>
-            <w:proofErr w:type="spellStart"/>
-            <w:r>
-              <w:rPr>
-                <w:rFonts w:ascii="Cambria" w:eastAsia="MS Mincho" w:hAnsi="Cambria"/>
-                <w:sz w:val="22"/>
-                <w:szCs w:val="22"/>
-              </w:rPr>
-              <w:t>si</w:t>
-            </w:r>
-            <w:proofErr w:type="spellEnd"/>
-            <w:r>
-              <w:rPr>
-                <w:rFonts w:ascii="Cambria" w:eastAsia="MS Mincho" w:hAnsi="Cambria"/>
-                <w:sz w:val="22"/>
-                <w:szCs w:val="22"/>
-              </w:rPr>
-              <w:t xml:space="preserve"> applicable)</w:t>
+              <w:t>Bridages (si applicable)</w:t>
             </w:r>
           </w:p>
         </w:tc>
@@ -2055,18 +1772,8 @@
                 <w:sz w:val="22"/>
                 <w:szCs w:val="22"/>
               </w:rPr>
-              <w:t xml:space="preserve">Performance des </w:t>
+              <w:t>Performance des éoliennes</w:t>
             </w:r>
-            <w:proofErr w:type="spellStart"/>
-            <w:r>
-              <w:rPr>
-                <w:rFonts w:ascii="Cambria" w:eastAsia="MS Mincho" w:hAnsi="Cambria"/>
-                <w:sz w:val="22"/>
-                <w:szCs w:val="22"/>
-              </w:rPr>
-              <w:t>éoliennes</w:t>
-            </w:r>
-            <w:proofErr w:type="spellEnd"/>
           </w:p>
         </w:tc>
         <w:tc>
@@ -2116,41 +1823,13 @@
                 <w:szCs w:val="22"/>
               </w:rPr>
             </w:pPr>
-            <w:proofErr w:type="spellStart"/>
             <w:r>
               <w:rPr>
                 <w:rFonts w:ascii="Cambria" w:eastAsia="MS Mincho" w:hAnsi="Cambria"/>
                 <w:sz w:val="22"/>
                 <w:szCs w:val="22"/>
               </w:rPr>
-              <w:t>Analyse</w:t>
-            </w:r>
-            <w:proofErr w:type="spellEnd"/>
-            <w:r>
-              <w:rPr>
-                <w:rFonts w:ascii="Cambria" w:eastAsia="MS Mincho" w:hAnsi="Cambria"/>
-                <w:sz w:val="22"/>
-                <w:szCs w:val="22"/>
-              </w:rPr>
-              <w:t xml:space="preserve"> du </w:t>
-            </w:r>
-            <w:proofErr w:type="spellStart"/>
-            <w:r>
-              <w:rPr>
-                <w:rFonts w:ascii="Cambria" w:eastAsia="MS Mincho" w:hAnsi="Cambria"/>
-                <w:sz w:val="22"/>
-                <w:szCs w:val="22"/>
-              </w:rPr>
-              <w:t>comportement</w:t>
-            </w:r>
-            <w:proofErr w:type="spellEnd"/>
-            <w:r>
-              <w:rPr>
-                <w:rFonts w:ascii="Cambria" w:eastAsia="MS Mincho" w:hAnsi="Cambria"/>
-                <w:sz w:val="22"/>
-                <w:szCs w:val="22"/>
-              </w:rPr>
-              <w:t xml:space="preserve"> du pitch</w:t>
+              <w:t>Analyse du comportement du pitch</w:t>
             </w:r>
           </w:p>
           <w:p>
@@ -2196,23 +1875,13 @@
                 <w:szCs w:val="22"/>
               </w:rPr>
             </w:pPr>
-            <w:proofErr w:type="spellStart"/>
             <w:r>
               <w:rPr>
                 <w:rFonts w:ascii="Cambria" w:eastAsia="MS Mincho" w:hAnsi="Cambria"/>
                 <w:sz w:val="22"/>
                 <w:szCs w:val="22"/>
               </w:rPr>
-              <w:t>Analyse</w:t>
-            </w:r>
-            <w:proofErr w:type="spellEnd"/>
-            <w:r>
-              <w:rPr>
-                <w:rFonts w:ascii="Cambria" w:eastAsia="MS Mincho" w:hAnsi="Cambria"/>
-                <w:sz w:val="22"/>
-                <w:szCs w:val="22"/>
-              </w:rPr>
-              <w:t xml:space="preserve"> inter-turbines</w:t>
+              <w:t>Analyse inter-turbines</w:t>
             </w:r>
           </w:p>
           <w:p>
@@ -2231,41 +1900,13 @@
                 <w:szCs w:val="22"/>
               </w:rPr>
             </w:pPr>
-            <w:proofErr w:type="spellStart"/>
             <w:r>
               <w:rPr>
                 <w:rFonts w:ascii="Cambria" w:eastAsia="MS Mincho" w:hAnsi="Cambria"/>
                 <w:sz w:val="22"/>
                 <w:szCs w:val="22"/>
               </w:rPr>
-              <w:t>Cohérence</w:t>
-            </w:r>
-            <w:proofErr w:type="spellEnd"/>
-            <w:r>
-              <w:rPr>
-                <w:rFonts w:ascii="Cambria" w:eastAsia="MS Mincho" w:hAnsi="Cambria"/>
-                <w:sz w:val="22"/>
-                <w:szCs w:val="22"/>
-              </w:rPr>
-              <w:t xml:space="preserve"> </w:t>
-            </w:r>
-            <w:proofErr w:type="spellStart"/>
-            <w:r>
-              <w:rPr>
-                <w:rFonts w:ascii="Cambria" w:eastAsia="MS Mincho" w:hAnsi="Cambria"/>
-                <w:sz w:val="22"/>
-                <w:szCs w:val="22"/>
-              </w:rPr>
-              <w:t>globale</w:t>
-            </w:r>
-            <w:proofErr w:type="spellEnd"/>
-            <w:r>
-              <w:rPr>
-                <w:rFonts w:ascii="Cambria" w:eastAsia="MS Mincho" w:hAnsi="Cambria"/>
-                <w:sz w:val="22"/>
-                <w:szCs w:val="22"/>
-              </w:rPr>
-              <w:t xml:space="preserve"> des performances</w:t>
+              <w:t>Cohérence globale des performances</w:t>
             </w:r>
           </w:p>
         </w:tc>
@@ -2301,13 +1942,8 @@
           <w:numId w:val="6"/>
         </w:numPr>
       </w:pPr>
-      <w:proofErr w:type="gramStart"/>
-      <w:r>
-        <w:t>variables</w:t>
-      </w:r>
-      <w:proofErr w:type="gramEnd"/>
-      <w:r>
-        <w:t xml:space="preserve"> environnementales : </w:t>
+      <w:r>
+        <w:t xml:space="preserve">variables environnementales : </w:t>
       </w:r>
     </w:p>
     <w:p>
@@ -2318,13 +1954,8 @@
           <w:numId w:val="6"/>
         </w:numPr>
       </w:pPr>
-      <w:proofErr w:type="gramStart"/>
-      <w:r>
-        <w:t>vitesse</w:t>
-      </w:r>
-      <w:proofErr w:type="gramEnd"/>
-      <w:r>
-        <w:t xml:space="preserve"> du vent </w:t>
+      <w:r>
+        <w:t xml:space="preserve">vitesse du vent </w:t>
       </w:r>
     </w:p>
     <w:p>
@@ -2335,13 +1966,8 @@
           <w:numId w:val="6"/>
         </w:numPr>
       </w:pPr>
-      <w:proofErr w:type="gramStart"/>
-      <w:r>
-        <w:t>direction</w:t>
-      </w:r>
-      <w:proofErr w:type="gramEnd"/>
-      <w:r>
-        <w:t xml:space="preserve"> du vent </w:t>
+      <w:r>
+        <w:t xml:space="preserve">direction du vent </w:t>
       </w:r>
     </w:p>
     <w:p>
@@ -2352,13 +1978,8 @@
           <w:numId w:val="6"/>
         </w:numPr>
       </w:pPr>
-      <w:proofErr w:type="gramStart"/>
-      <w:r>
-        <w:t>température</w:t>
-      </w:r>
-      <w:proofErr w:type="gramEnd"/>
-      <w:r>
-        <w:t xml:space="preserve"> ambiante </w:t>
+      <w:r>
+        <w:t xml:space="preserve">température ambiante </w:t>
       </w:r>
     </w:p>
     <w:p>
@@ -2369,13 +1990,8 @@
           <w:numId w:val="6"/>
         </w:numPr>
       </w:pPr>
-      <w:proofErr w:type="gramStart"/>
-      <w:r>
-        <w:t>variables</w:t>
-      </w:r>
-      <w:proofErr w:type="gramEnd"/>
-      <w:r>
-        <w:t xml:space="preserve"> opérationnelles clés : </w:t>
+      <w:r>
+        <w:t xml:space="preserve">variables opérationnelles clés : </w:t>
       </w:r>
     </w:p>
     <w:p>
@@ -2386,13 +2002,8 @@
           <w:numId w:val="6"/>
         </w:numPr>
       </w:pPr>
-      <w:proofErr w:type="gramStart"/>
-      <w:r>
-        <w:t>puissance</w:t>
-      </w:r>
-      <w:proofErr w:type="gramEnd"/>
-      <w:r>
-        <w:t xml:space="preserve"> active produite </w:t>
+      <w:r>
+        <w:t xml:space="preserve">puissance active produite </w:t>
       </w:r>
     </w:p>
     <w:p/>
@@ -2413,29 +2024,13 @@
         <w:t xml:space="preserve">La figure ci-après présente la disponibilité des données SCADA, sur la période allant du </w:t>
       </w:r>
       <w:r>
-        <w:t>{{</w:t>
-      </w:r>
-      <w:proofErr w:type="spellStart"/>
-      <w:r>
-        <w:t>analysis_start</w:t>
-      </w:r>
-      <w:proofErr w:type="spellEnd"/>
-      <w:r>
-        <w:t>}}</w:t>
+        <w:t>{{analysis_start}}</w:t>
       </w:r>
       <w:r>
         <w:t xml:space="preserve"> au </w:t>
       </w:r>
       <w:r>
-        <w:t>{{</w:t>
-      </w:r>
-      <w:proofErr w:type="spellStart"/>
-      <w:r>
-        <w:t>analysis_end</w:t>
-      </w:r>
-      <w:proofErr w:type="spellEnd"/>
-      <w:r>
-        <w:t>}}</w:t>
+        <w:t>{{analysis_end}}</w:t>
       </w:r>
       <w:r>
         <w:t>.</w:t>
@@ -2518,28 +2113,14 @@
         <w:rPr>
           <w:lang w:val="en-US"/>
         </w:rPr>
-        <w:t>{{</w:t>
-      </w:r>
-      <w:proofErr w:type="spellStart"/>
-      <w:r>
+        <w:t>{{data_availability_chart}}</w:t>
+      </w:r>
+    </w:p>
+    <w:p>
+      <w:pPr>
         <w:rPr>
           <w:lang w:val="en-US"/>
         </w:rPr>
-        <w:t>data_availability_chart</w:t>
-      </w:r>
-      <w:proofErr w:type="spellEnd"/>
-      <w:r>
-        <w:rPr>
-          <w:lang w:val="en-US"/>
-        </w:rPr>
-        <w:t>}}</w:t>
-      </w:r>
-    </w:p>
-    <w:p>
-      <w:pPr>
-        <w:rPr>
-          <w:lang w:val="en-US"/>
-        </w:rPr>
       </w:pPr>
     </w:p>
     <w:p>
@@ -2547,15 +2128,7 @@
         <w:pStyle w:val="Titre2"/>
       </w:pPr>
       <w:r>
-        <w:t xml:space="preserve">Disponibilité </w:t>
-      </w:r>
-      <w:proofErr w:type="spellStart"/>
-      <w:r>
-        <w:t>éner</w:t>
-      </w:r>
-      <w:proofErr w:type="spellEnd"/>
-      <w:r>
-        <w:t xml:space="preserve"> gétique </w:t>
+        <w:t xml:space="preserve">Disponibilité éner gétique </w:t>
       </w:r>
     </w:p>
     <w:p>
@@ -2577,23 +2150,7 @@
         </w:numPr>
       </w:pPr>
       <w:r>
-        <w:t>Disponibilité énergétique brute (</w:t>
-      </w:r>
-      <w:proofErr w:type="spellStart"/>
-      <w:r>
-        <w:t>cut</w:t>
-      </w:r>
-      <w:proofErr w:type="spellEnd"/>
-      <w:r>
-        <w:t xml:space="preserve">-in / </w:t>
-      </w:r>
-      <w:proofErr w:type="spellStart"/>
-      <w:r>
-        <w:t>cut</w:t>
-      </w:r>
-      <w:proofErr w:type="spellEnd"/>
-      <w:r>
-        <w:t>-out) : calculée pour les périodes où la vitesse de vent est comprise entre les seuils de démarrage et d’arrêt des éoliennes, en incluant l’ensemble des indisponibilités (arrêts techniques, maintenance, limitations réseau, etc.)</w:t>
+        <w:t>Disponibilité énergétique brute (cut-in / cut-out) : calculée pour les périodes où la vitesse de vent est comprise entre les seuils de démarrage et d’arrêt des éoliennes, en incluant l’ensemble des indisponibilités (arrêts techniques, maintenance, limitations réseau, etc.)</w:t>
       </w:r>
     </w:p>
     <w:p>
@@ -2682,29 +2239,8 @@
           <w:numId w:val="8"/>
         </w:numPr>
       </w:pPr>
-      <w:proofErr w:type="gramStart"/>
-      <w:r>
-        <w:t>la</w:t>
-      </w:r>
-      <w:proofErr w:type="gramEnd"/>
-      <w:r>
-        <w:t xml:space="preserve"> disponibilité énergétique brute (</w:t>
-      </w:r>
-      <w:proofErr w:type="spellStart"/>
-      <w:r>
-        <w:t>cut</w:t>
-      </w:r>
-      <w:proofErr w:type="spellEnd"/>
-      <w:r>
-        <w:t xml:space="preserve">-in / </w:t>
-      </w:r>
-      <w:proofErr w:type="spellStart"/>
-      <w:r>
-        <w:t>cut</w:t>
-      </w:r>
-      <w:proofErr w:type="spellEnd"/>
-      <w:r>
-        <w:t>-out),</w:t>
+      <w:r>
+        <w:t>la disponibilité énergétique brute (cut-in / cut-out),</w:t>
       </w:r>
     </w:p>
     <w:p>
@@ -2715,13 +2251,8 @@
           <w:numId w:val="8"/>
         </w:numPr>
       </w:pPr>
-      <w:proofErr w:type="gramStart"/>
-      <w:r>
-        <w:t>la</w:t>
-      </w:r>
-      <w:proofErr w:type="gramEnd"/>
-      <w:r>
-        <w:t xml:space="preserve"> disponibilité énergétique imputable au fabricant</w:t>
+      <w:r>
+        <w:t>la disponibilité énergétique imputable au fabricant</w:t>
       </w:r>
     </w:p>
     <w:p>
@@ -2734,21 +2265,20 @@
         <w:rPr>
           <w:lang w:val="en-US"/>
         </w:rPr>
-        <w:t>[</w:t>
-      </w:r>
-      <w:proofErr w:type="gramStart"/>
-      <w:r>
+        <w:t>[TABLE:EBA_CUT_IN_CUT_OUT_TABLE]</w:t>
+      </w:r>
+    </w:p>
+    <w:p>
+      <w:pPr>
         <w:rPr>
           <w:lang w:val="en-US"/>
         </w:rPr>
-        <w:t>TABLE:EBA</w:t>
-      </w:r>
-      <w:proofErr w:type="gramEnd"/>
+      </w:pPr>
       <w:r>
         <w:rPr>
           <w:lang w:val="en-US"/>
         </w:rPr>
-        <w:t>_CUT_IN_CUT_OUT_TABLE]</w:t>
+        <w:t>{{eba_cut_in_cut_out_chart}}</w:t>
       </w:r>
     </w:p>
     <w:p>
@@ -2757,25 +2287,24 @@
           <w:lang w:val="en-US"/>
         </w:rPr>
       </w:pPr>
-      <w:r>
+    </w:p>
+    <w:p>
+      <w:pPr>
         <w:rPr>
           <w:lang w:val="en-US"/>
         </w:rPr>
-        <w:t>{{</w:t>
-      </w:r>
-      <w:proofErr w:type="spellStart"/>
+      </w:pPr>
       <w:r>
         <w:rPr>
           <w:lang w:val="en-US"/>
         </w:rPr>
-        <w:t>eba_cut_in_cut_out_chart</w:t>
-      </w:r>
-      <w:proofErr w:type="spellEnd"/>
+        <w:t>[TABLE:EBA_MANUFACTURER_TABLE]</w:t>
+      </w:r>
       <w:r>
         <w:rPr>
           <w:lang w:val="en-US"/>
         </w:rPr>
-        <w:t>}}</w:t>
+        <w:t xml:space="preserve"> </w:t>
       </w:r>
     </w:p>
     <w:p>
@@ -2784,131 +2313,55 @@
           <w:lang w:val="en-US"/>
         </w:rPr>
       </w:pPr>
-    </w:p>
-    <w:p>
-      <w:pPr>
+      <w:r>
         <w:rPr>
           <w:lang w:val="en-US"/>
         </w:rPr>
-      </w:pPr>
-      <w:r>
+        <w:t>{{eba_manifacturer_chart}}</w:t>
+      </w:r>
+    </w:p>
+    <w:p>
+      <w:pPr>
         <w:rPr>
           <w:lang w:val="en-US"/>
         </w:rPr>
-        <w:t>[</w:t>
-      </w:r>
-      <w:proofErr w:type="gramStart"/>
-      <w:r>
+      </w:pPr>
+    </w:p>
+    <w:p>
+      <w:r>
+        <w:t>[TABLE:EBA_LOSS_TABLE]</w:t>
+      </w:r>
+    </w:p>
+    <w:p>
+      <w:r>
+        <w:t>En complément, les figures suivantes illustrent les pertes énergétiques associées aux indisponibilités, en mettant en évidence leur répartition dans le temps ainsi que leur contribution relative.</w:t>
+      </w:r>
+    </w:p>
+    <w:p/>
+    <w:p>
+      <w:pPr>
         <w:rPr>
           <w:lang w:val="en-US"/>
         </w:rPr>
-        <w:t>TABLE:EBA</w:t>
-      </w:r>
-      <w:proofErr w:type="gramEnd"/>
+      </w:pPr>
       <w:r>
         <w:rPr>
           <w:lang w:val="en-US"/>
         </w:rPr>
-        <w:t>_MANUFACTURER_TABLE]</w:t>
-      </w:r>
-      <w:r>
+        <w:t>[TODO.ANALYSE]</w:t>
+      </w:r>
+    </w:p>
+    <w:p>
+      <w:pPr>
         <w:rPr>
           <w:lang w:val="en-US"/>
         </w:rPr>
-        <w:t xml:space="preserve"> </w:t>
-      </w:r>
-    </w:p>
-    <w:p>
-      <w:pPr>
+      </w:pPr>
+      <w:r>
         <w:rPr>
           <w:lang w:val="en-US"/>
         </w:rPr>
-      </w:pPr>
-      <w:r>
-        <w:rPr>
-          <w:lang w:val="en-US"/>
-        </w:rPr>
-        <w:t>{{</w:t>
-      </w:r>
-      <w:proofErr w:type="spellStart"/>
-      <w:r>
-        <w:rPr>
-          <w:lang w:val="en-US"/>
-        </w:rPr>
-        <w:t>eba_manifacturer_chart</w:t>
-      </w:r>
-      <w:proofErr w:type="spellEnd"/>
-      <w:r>
-        <w:rPr>
-          <w:lang w:val="en-US"/>
-        </w:rPr>
-        <w:t>}}</w:t>
-      </w:r>
-    </w:p>
-    <w:p>
-      <w:pPr>
-        <w:rPr>
-          <w:lang w:val="en-US"/>
-        </w:rPr>
-      </w:pPr>
-    </w:p>
-    <w:p>
-      <w:r>
-        <w:t>[</w:t>
-      </w:r>
-      <w:proofErr w:type="gramStart"/>
-      <w:r>
-        <w:t>TABLE:EBA</w:t>
-      </w:r>
-      <w:proofErr w:type="gramEnd"/>
-      <w:r>
-        <w:t>_LOSS_TABLE]</w:t>
-      </w:r>
-    </w:p>
-    <w:p>
-      <w:r>
-        <w:t>En complément, les figures suivantes illustrent les pertes énergétiques associées aux indisponibilités, en mettant en évidence leur répartition dans le temps ainsi que leur contribution relative.</w:t>
-      </w:r>
-    </w:p>
-    <w:p/>
-    <w:p>
-      <w:pPr>
-        <w:rPr>
-          <w:lang w:val="en-US"/>
-        </w:rPr>
-      </w:pPr>
-      <w:r>
-        <w:rPr>
-          <w:lang w:val="en-US"/>
-        </w:rPr>
-        <w:t>[TODO.ANALYSE]</w:t>
-      </w:r>
-    </w:p>
-    <w:p>
-      <w:pPr>
-        <w:rPr>
-          <w:lang w:val="en-US"/>
-        </w:rPr>
-      </w:pPr>
-      <w:r>
-        <w:rPr>
-          <w:lang w:val="en-US"/>
-        </w:rPr>
-        <w:t>{{</w:t>
-      </w:r>
-      <w:proofErr w:type="spellStart"/>
-      <w:r>
-        <w:rPr>
-          <w:lang w:val="en-US"/>
-        </w:rPr>
-        <w:t>eba_loss_chart</w:t>
-      </w:r>
-      <w:proofErr w:type="spellEnd"/>
-      <w:r>
-        <w:rPr>
-          <w:lang w:val="en-US"/>
-        </w:rPr>
-        <w:t>}}</w:t>
+        <w:t>{{eba_loss_chart}}</w:t>
       </w:r>
     </w:p>
     <w:p>
@@ -3029,94 +2482,82 @@
         <w:rPr>
           <w:lang w:val="en-US"/>
         </w:rPr>
-        <w:t>[</w:t>
-      </w:r>
-      <w:proofErr w:type="gramStart"/>
+        <w:t>[TABLE:ERROR_</w:t>
+      </w:r>
       <w:r>
         <w:rPr>
           <w:lang w:val="en-US"/>
         </w:rPr>
-        <w:t>TABLE:ERROR</w:t>
-      </w:r>
-      <w:proofErr w:type="gramEnd"/>
+        <w:t>CODE_</w:t>
+      </w:r>
       <w:r>
         <w:rPr>
           <w:lang w:val="en-US"/>
         </w:rPr>
-        <w:t>_</w:t>
-      </w:r>
-      <w:r>
+        <w:t>PARETO_FREQUENCY]</w:t>
+      </w:r>
+    </w:p>
+    <w:p>
+      <w:pPr>
         <w:rPr>
           <w:lang w:val="en-US"/>
         </w:rPr>
+      </w:pPr>
+      <w:r>
+        <w:rPr>
+          <w:lang w:val="en-US"/>
+        </w:rPr>
+        <w:t>[TABLE:ERROR_</w:t>
+      </w:r>
+      <w:r>
+        <w:rPr>
+          <w:lang w:val="en-US"/>
+        </w:rPr>
         <w:t>CODE_</w:t>
       </w:r>
       <w:r>
         <w:rPr>
           <w:lang w:val="en-US"/>
         </w:rPr>
-        <w:t>PARETO_FREQUENCY]</w:t>
-      </w:r>
-    </w:p>
-    <w:p>
-      <w:pPr>
+        <w:t>PARETO_</w:t>
+      </w:r>
+      <w:r>
         <w:rPr>
           <w:lang w:val="en-US"/>
         </w:rPr>
-      </w:pPr>
-    </w:p>
-    <w:p>
-      <w:pPr>
+        <w:t>DURATION</w:t>
+      </w:r>
+      <w:r>
         <w:rPr>
           <w:lang w:val="en-US"/>
         </w:rPr>
-      </w:pPr>
-      <w:r>
+        <w:t>]</w:t>
+      </w:r>
+    </w:p>
+    <w:p>
+      <w:pPr>
         <w:rPr>
           <w:lang w:val="en-US"/>
         </w:rPr>
-        <w:t>{{</w:t>
-      </w:r>
-      <w:proofErr w:type="spellStart"/>
+      </w:pPr>
       <w:r>
         <w:rPr>
           <w:lang w:val="en-US"/>
         </w:rPr>
-        <w:t>top_error_code_frequency</w:t>
-      </w:r>
-      <w:proofErr w:type="spellEnd"/>
-      <w:r>
+        <w:t>{{top_error_code_frequency}}</w:t>
+      </w:r>
+    </w:p>
+    <w:p>
+      <w:pPr>
         <w:rPr>
           <w:lang w:val="en-US"/>
         </w:rPr>
-        <w:t>}}</w:t>
-      </w:r>
-    </w:p>
-    <w:p>
-      <w:pPr>
+      </w:pPr>
+      <w:r>
         <w:rPr>
           <w:lang w:val="en-US"/>
         </w:rPr>
-      </w:pPr>
-      <w:r>
-        <w:rPr>
-          <w:lang w:val="en-US"/>
-        </w:rPr>
-        <w:t>{{</w:t>
-      </w:r>
-      <w:proofErr w:type="spellStart"/>
-      <w:r>
-        <w:rPr>
-          <w:lang w:val="en-US"/>
-        </w:rPr>
-        <w:t>treemap_error_code</w:t>
-      </w:r>
-      <w:proofErr w:type="spellEnd"/>
-      <w:r>
-        <w:rPr>
-          <w:lang w:val="en-US"/>
-        </w:rPr>
-        <w:t>}}</w:t>
+        <w:t>{{treemap_error_code}}</w:t>
       </w:r>
     </w:p>
     <w:p>
@@ -3135,23 +2576,7 @@
     </w:p>
     <w:p>
       <w:r>
-        <w:t>L’analyse de la direction du vent vise à vérifier la cohérence des mesures directionnelles entre les éoliennes, ainsi que leur alignement avec une référence externe, afin de détecter d’éventuels défauts d’orientation (</w:t>
-      </w:r>
-      <w:proofErr w:type="spellStart"/>
-      <w:r>
-        <w:t>yaw</w:t>
-      </w:r>
-      <w:proofErr w:type="spellEnd"/>
-      <w:r>
-        <w:t xml:space="preserve"> </w:t>
-      </w:r>
-      <w:proofErr w:type="spellStart"/>
-      <w:r>
-        <w:t>misalignment</w:t>
-      </w:r>
-      <w:proofErr w:type="spellEnd"/>
-      <w:r>
-        <w:t>).</w:t>
+        <w:t>L’analyse de la direction du vent vise à vérifier la cohérence des mesures directionnelles entre les éoliennes, ainsi que leur alignement avec une référence externe, afin de détecter d’éventuels défauts d’orientation (yaw misalignment).</w:t>
       </w:r>
     </w:p>
     <w:p>
@@ -3221,21 +2646,20 @@
         <w:rPr>
           <w:lang w:val="en-US"/>
         </w:rPr>
-        <w:t>[</w:t>
-      </w:r>
-      <w:proofErr w:type="gramStart"/>
-      <w:r>
+        <w:t>[TABLE:TIP_SPEED_RATIO_TABLE]</w:t>
+      </w:r>
+    </w:p>
+    <w:p>
+      <w:pPr>
         <w:rPr>
           <w:lang w:val="en-US"/>
         </w:rPr>
-        <w:t>TABLE:TIP</w:t>
-      </w:r>
-      <w:proofErr w:type="gramEnd"/>
+      </w:pPr>
       <w:r>
         <w:rPr>
           <w:lang w:val="en-US"/>
         </w:rPr>
-        <w:t>_SPEED_RATIO_TABLE]</w:t>
+        <w:t>{{wind_direction_calibration}}</w:t>
       </w:r>
     </w:p>
     <w:p>
@@ -3248,66 +2672,17 @@
         <w:rPr>
           <w:lang w:val="en-US"/>
         </w:rPr>
-        <w:t>{{</w:t>
-      </w:r>
-      <w:proofErr w:type="spellStart"/>
-      <w:r>
+        <w:t>{{power_rose_chart}}</w:t>
+      </w:r>
+    </w:p>
+    <w:p>
+      <w:pPr>
         <w:rPr>
           <w:lang w:val="en-US"/>
         </w:rPr>
-        <w:t>wind_direction_calibration</w:t>
-      </w:r>
-      <w:proofErr w:type="spellEnd"/>
-      <w:r>
-        <w:rPr>
-          <w:lang w:val="en-US"/>
-        </w:rPr>
-        <w:t>}}</w:t>
-      </w:r>
-    </w:p>
-    <w:p>
-      <w:pPr>
-        <w:rPr>
-          <w:lang w:val="en-US"/>
-        </w:rPr>
-      </w:pPr>
-      <w:r>
-        <w:rPr>
-          <w:lang w:val="en-US"/>
-        </w:rPr>
-        <w:t>{{</w:t>
-      </w:r>
-      <w:proofErr w:type="spellStart"/>
-      <w:r>
-        <w:rPr>
-          <w:lang w:val="en-US"/>
-        </w:rPr>
-        <w:t>power_rose_chart</w:t>
-      </w:r>
-      <w:proofErr w:type="spellEnd"/>
-      <w:r>
-        <w:rPr>
-          <w:lang w:val="en-US"/>
-        </w:rPr>
-        <w:t>}}</w:t>
-      </w:r>
-    </w:p>
-    <w:p>
-      <w:pPr>
-        <w:rPr>
-          <w:lang w:val="en-US"/>
-        </w:rPr>
-      </w:pPr>
-      <w:r>
-        <w:t>{{</w:t>
-      </w:r>
-      <w:proofErr w:type="spellStart"/>
-      <w:r>
-        <w:t>wind_rose_chart</w:t>
-      </w:r>
-      <w:proofErr w:type="spellEnd"/>
-      <w:r>
-        <w:t>}}</w:t>
+      </w:pPr>
+      <w:r>
+        <w:t>{{wind_rose_chart}}</w:t>
       </w:r>
     </w:p>
     <w:p>
@@ -3394,15 +2769,7 @@
         <w:t>Exclusion</w:t>
       </w:r>
       <w:r>
-        <w:t xml:space="preserve"> des situations de sillage (wake </w:t>
-      </w:r>
-      <w:proofErr w:type="spellStart"/>
-      <w:r>
-        <w:t>effect</w:t>
-      </w:r>
-      <w:proofErr w:type="spellEnd"/>
-      <w:r>
-        <w:t xml:space="preserve">), </w:t>
+        <w:t xml:space="preserve"> des situations de sillage (wake effect), </w:t>
       </w:r>
     </w:p>
     <w:p>
@@ -3465,21 +2832,7 @@
         <w:rPr>
           <w:lang w:val="en-US"/>
         </w:rPr>
-        <w:t>[</w:t>
-      </w:r>
-      <w:proofErr w:type="gramStart"/>
-      <w:r>
-        <w:rPr>
-          <w:lang w:val="en-US"/>
-        </w:rPr>
-        <w:t>TABLE:NORMATIVE</w:t>
-      </w:r>
-      <w:proofErr w:type="gramEnd"/>
-      <w:r>
-        <w:rPr>
-          <w:lang w:val="en-US"/>
-        </w:rPr>
-        <w:t>_YIELD_TABLE]</w:t>
+        <w:t>[TABLE:NORMATIVE_YIELD_TABLE]</w:t>
       </w:r>
     </w:p>
     <w:p>
@@ -3526,13 +2879,8 @@
           <w:numId w:val="13"/>
         </w:numPr>
       </w:pPr>
-      <w:proofErr w:type="gramStart"/>
-      <w:r>
-        <w:t>les</w:t>
-      </w:r>
-      <w:proofErr w:type="gramEnd"/>
-      <w:r>
-        <w:t xml:space="preserve"> périodes de limitations environnementales (bruit, chauves-souris, ombrage, etc.), </w:t>
+      <w:r>
+        <w:t xml:space="preserve">les périodes de limitations environnementales (bruit, chauves-souris, ombrage, etc.), </w:t>
       </w:r>
     </w:p>
     <w:p>
@@ -3543,13 +2891,8 @@
           <w:numId w:val="13"/>
         </w:numPr>
       </w:pPr>
-      <w:proofErr w:type="gramStart"/>
-      <w:r>
-        <w:t>les</w:t>
-      </w:r>
-      <w:proofErr w:type="gramEnd"/>
-      <w:r>
-        <w:t xml:space="preserve"> phases de démarrage et d’arrêt, </w:t>
+      <w:r>
+        <w:t xml:space="preserve">les phases de démarrage et d’arrêt, </w:t>
       </w:r>
     </w:p>
     <w:p>
@@ -3560,13 +2903,8 @@
           <w:numId w:val="13"/>
         </w:numPr>
       </w:pPr>
-      <w:proofErr w:type="gramStart"/>
-      <w:r>
-        <w:t>les</w:t>
-      </w:r>
-      <w:proofErr w:type="gramEnd"/>
-      <w:r>
-        <w:t xml:space="preserve"> situations transitoires ou non représentatives du fonctionnement normal. </w:t>
+      <w:r>
+        <w:t xml:space="preserve">les situations transitoires ou non représentatives du fonctionnement normal. </w:t>
       </w:r>
     </w:p>
     <w:p>
@@ -3622,11 +2960,9 @@
         </w:rPr>
         <w:t>{{</w:t>
       </w:r>
-      <w:proofErr w:type="spellStart"/>
       <w:r>
         <w:t>rpm_chart</w:t>
       </w:r>
-      <w:proofErr w:type="spellEnd"/>
       <w:r>
         <w:rPr>
           <w:lang w:val="en-US"/>
@@ -3771,15 +3107,7 @@
     </w:p>
     <w:p>
       <w:r>
-        <w:t xml:space="preserve">En complément de l'analyse comparative des courbes de puissance, une analyse individuelle de chaque éolienne est réalisée à partir des données SCADA brutes, sous forme de nuages de points. Cette approche vise à détecter d'éventuelles limitations de production non prévues, non nécessairement visibles dans une comparaison inter-éoliennes. Elle permet notamment d'identifier des situations de </w:t>
-      </w:r>
-      <w:proofErr w:type="spellStart"/>
-      <w:r>
-        <w:t>curtailment</w:t>
-      </w:r>
-      <w:proofErr w:type="spellEnd"/>
-      <w:r>
-        <w:t xml:space="preserve"> inattendu, visibles à travers des regroupements de points (clusters) s'écartant de la courbe de puissance nominale attendue. L'analyse repose sur la représentation de la puissance active en fonction de la vitesse du vent sous forme de nuages de points. Afin de représenter le comportement nominal des éoliennes, les données sont filtrées pour exclure :</w:t>
+        <w:t>En complément de l'analyse comparative des courbes de puissance, une analyse individuelle de chaque éolienne est réalisée à partir des données SCADA brutes, sous forme de nuages de points. Cette approche vise à détecter d'éventuelles limitations de production non prévues, non nécessairement visibles dans une comparaison inter-éoliennes. Elle permet notamment d'identifier des situations de curtailment inattendu, visibles à travers des regroupements de points (clusters) s'écartant de la courbe de puissance nominale attendue. L'analyse repose sur la représentation de la puissance active en fonction de la vitesse du vent sous forme de nuages de points. Afin de représenter le comportement nominal des éoliennes, les données sont filtrées pour exclure :</w:t>
       </w:r>
     </w:p>
     <w:p>
@@ -3790,13 +3118,8 @@
           <w:numId w:val="15"/>
         </w:numPr>
       </w:pPr>
-      <w:proofErr w:type="gramStart"/>
-      <w:r>
-        <w:t>les</w:t>
-      </w:r>
-      <w:proofErr w:type="gramEnd"/>
-      <w:r>
-        <w:t xml:space="preserve"> périodes de limitations environnementales (bruit, chauves-souris, ombrage, etc.), </w:t>
+      <w:r>
+        <w:t xml:space="preserve">les périodes de limitations environnementales (bruit, chauves-souris, ombrage, etc.), </w:t>
       </w:r>
     </w:p>
     <w:p>
@@ -3807,13 +3130,8 @@
           <w:numId w:val="15"/>
         </w:numPr>
       </w:pPr>
-      <w:proofErr w:type="gramStart"/>
-      <w:r>
-        <w:t>les</w:t>
-      </w:r>
-      <w:proofErr w:type="gramEnd"/>
-      <w:r>
-        <w:t xml:space="preserve"> phases de démarrage et d'arrêt,</w:t>
+      <w:r>
+        <w:t>les phases de démarrage et d'arrêt,</w:t>
       </w:r>
     </w:p>
     <w:p>
@@ -3824,13 +3142,8 @@
           <w:numId w:val="15"/>
         </w:numPr>
       </w:pPr>
-      <w:proofErr w:type="gramStart"/>
-      <w:r>
-        <w:t>ainsi</w:t>
-      </w:r>
-      <w:proofErr w:type="gramEnd"/>
-      <w:r>
-        <w:t xml:space="preserve"> que les situations non représentatives du fonctionnement normal. </w:t>
+      <w:r>
+        <w:t xml:space="preserve">ainsi que les situations non représentatives du fonctionnement normal. </w:t>
       </w:r>
     </w:p>
     <w:p>
@@ -3839,14 +3152,9 @@
       </w:r>
     </w:p>
     <w:p>
-      <w:proofErr w:type="gramStart"/>
       <w:r>
         <w:lastRenderedPageBreak/>
-        <w:t>préciser</w:t>
-      </w:r>
-      <w:proofErr w:type="gramEnd"/>
-      <w:r>
-        <w:t xml:space="preserve"> quelle éolienne est présentée dans le corps du rapport et lesquelles sont renvoyées en annexe, cohérence à maintenir avec l'analyse comparative des courbes de puissance. Dans l'étude de référence, E9 est présentée dans le corps du rapport.]</w:t>
+        <w:t>préciser quelle éolienne est présentée dans le corps du rapport et lesquelles sont renvoyées en annexe, cohérence à maintenir avec l'analyse comparative des courbes de puissance. Dans l'étude de référence, E9 est présentée dans le corps du rapport.]</w:t>
       </w:r>
     </w:p>
     <w:p>
@@ -3908,15 +3216,7 @@
         <w:pStyle w:val="Titre2"/>
       </w:pPr>
       <w:r>
-        <w:t xml:space="preserve">Disponibilité temporelle (Time-Based </w:t>
-      </w:r>
-      <w:proofErr w:type="spellStart"/>
-      <w:r>
-        <w:t>Availability</w:t>
-      </w:r>
-      <w:proofErr w:type="spellEnd"/>
-      <w:r>
-        <w:t xml:space="preserve"> – TBA)</w:t>
+        <w:t>Disponibilité temporelle (Time-Based Availability – TBA)</w:t>
       </w:r>
     </w:p>
     <w:p>

</xml_diff>